<commit_message>
polish(paper): remove internal scaffolding notes from Appendix B and §6.14
Appendix B intro now reads as academic rationale instead of referencing
an internal development rule. §6.14 lead note trimmed to a reproducibility
reference only. Regenerated DOCX and PDF.
</commit_message>
<xml_diff>
--- a/Paper/final_dissertation.docx
+++ b/Paper/final_dissertation.docx
@@ -76,7 +76,7 @@
         <w:t xml:space="preserve">refers to post-BRI associations and trade-balance dynamics observed in the data, not to a causal effect established through experimental or quasi-experimental identification. The analysis is explicitly diagnostic and associational. No claim of causal identification is made.</w:t>
       </w:r>
     </w:p>
-    <w:bookmarkStart w:id="93" w:name="abstract"/>
+    <w:bookmarkStart w:id="177" w:name="abstract"/>
     <w:p>
       <w:pPr>
         <w:pStyle w:val="Heading1"/>
@@ -150,8 +150,8 @@
         <w:t xml:space="preserve">Belt and Road Initiative; Kazakhstan–China trade; strategic minerals; asymmetric interdependence; trade balance; small-sample diagnostics; post-BRI period</w:t>
       </w:r>
     </w:p>
-    <w:bookmarkEnd w:id="93"/>
-    <w:bookmarkStart w:id="96" w:name="introduction"/>
+    <w:bookmarkEnd w:id="177"/>
+    <w:bookmarkStart w:id="180" w:name="introduction"/>
     <w:p>
       <w:pPr>
         <w:pStyle w:val="Heading1"/>
@@ -284,7 +284,7 @@
         <w:t xml:space="preserve">These results are interpreted as strong diagnostic evidence that Kazakhstan’s bilateral trade deterioration post-BRI is China-specific and consistent with asymmetric interdependence deepening. The regression interaction is fragile; the cross-partner identification is robust. The strongest empirical contributions are: (i) the descriptive decomposition showing import-side deepening as the primary mechanism; (ii) the TWFE DiD demonstrating China-specificity; and (iii) transparent reporting of regression fragility.</w:t>
       </w:r>
     </w:p>
-    <w:bookmarkStart w:id="94" w:name="contribution"/>
+    <w:bookmarkStart w:id="178" w:name="contribution"/>
     <w:p>
       <w:pPr>
         <w:pStyle w:val="Heading2"/>
@@ -301,8 +301,8 @@
         <w:t xml:space="preserve">This thesis makes five specific contributions. First, it distinguishes between trade expansion and trade-balance improvement, shifting attention from aggregate trade volumes to bilateral trade-balance outcomes in a diagnostic case study of Kazakhstan and China. Second, it bridges theory and method by using asymmetric interdependence to interpret the moderating compositional channel of strategic mineral exports, accommodating both mutual gains and distributional asymmetry. Third, it tests whether strategic mineral exports translated into external-balance improvement, demonstrating that resource-export growth is not inherently synonymous with an improved external position. Fourth, it provides a transparent and reproducible annual Kazakhstan–China single country-pair dataset with a fully scripted pipeline. Fifth, it treats the results explicitly as diagnostic and fragile, deploying small-sample robustness checks and influence diagnostics to document the critical role of 2023. By providing an honest interpretation of fragility, the thesis strengthens methodological discipline and avoids claiming definitive causal identification of a stable structural effect.</w:t>
       </w:r>
     </w:p>
-    <w:bookmarkEnd w:id="94"/>
-    <w:bookmarkStart w:id="95" w:name="structure"/>
+    <w:bookmarkEnd w:id="178"/>
+    <w:bookmarkStart w:id="179" w:name="structure"/>
     <w:p>
       <w:pPr>
         <w:pStyle w:val="Heading2"/>
@@ -319,9 +319,9 @@
         <w:t xml:space="preserve">The remainder of this thesis is organised as follows. Chapter 2 reviews the literature and identifies the research gap. Chapter 3 presents the theoretical framework. Chapter 4 describes the data, variable construction, and data limitations. Chapter 5 explains the empirical strategy. Chapter 6 presents the results, including influence diagnostics and model stability analysis. Chapter 7 discusses the findings and their implications. Chapter 8 concludes.</w:t>
       </w:r>
     </w:p>
-    <w:bookmarkEnd w:id="95"/>
-    <w:bookmarkEnd w:id="96"/>
-    <w:bookmarkStart w:id="104" w:name="literature-review"/>
+    <w:bookmarkEnd w:id="179"/>
+    <w:bookmarkEnd w:id="180"/>
+    <w:bookmarkStart w:id="188" w:name="literature-review"/>
     <w:p>
       <w:pPr>
         <w:pStyle w:val="Heading1"/>
@@ -338,7 +338,7 @@
         <w:t xml:space="preserve">The literature relevant to Kazakhstan–China trade under BRI spans several overlapping debates. Rather than summarising individual studies, this review synthesises what the literature agrees on, identifies disagreements and limitations, and explains how each strand connects to the research question.</w:t>
       </w:r>
     </w:p>
-    <w:bookmarkStart w:id="97" w:name="X2930bc3edf58adf9f1388ee5b893d7488b5e345"/>
+    <w:bookmarkStart w:id="181" w:name="X2930bc3edf58adf9f1388ee5b893d7488b5e345"/>
     <w:p>
       <w:pPr>
         <w:pStyle w:val="Heading2"/>
@@ -503,8 +503,8 @@
         <w:t xml:space="preserve">interaction in H3.</w:t>
       </w:r>
     </w:p>
-    <w:bookmarkEnd w:id="97"/>
-    <w:bookmarkStart w:id="98" w:name="Xe70771352f1ad036bac85112bc90e3cc68c7f96"/>
+    <w:bookmarkEnd w:id="181"/>
+    <w:bookmarkStart w:id="182" w:name="Xe70771352f1ad036bac85112bc90e3cc68c7f96"/>
     <w:p>
       <w:pPr>
         <w:pStyle w:val="Heading2"/>
@@ -710,8 +710,8 @@
         <w:t xml:space="preserve">on the bilateral balance via the Marshall–Lerner condition.</w:t>
       </w:r>
     </w:p>
-    <w:bookmarkEnd w:id="98"/>
-    <w:bookmarkStart w:id="99" w:name="bri-as-trade-facilitation"/>
+    <w:bookmarkEnd w:id="182"/>
+    <w:bookmarkStart w:id="183" w:name="bri-as-trade-facilitation"/>
     <w:p>
       <w:pPr>
         <w:pStyle w:val="Heading2"/>
@@ -860,8 +860,8 @@
         <w:t xml:space="preserve">period dummy as a partial test of trade-cost reduction, while noting that the dummy conflates BRI-specific effects with concurrent commodity shocks. The comparative DiD design (§6.5) addresses this limitation by testing whether the post-2013 balance shift is China-specific or common across all of Kazakhstan’s trading partners.</w:t>
       </w:r>
     </w:p>
-    <w:bookmarkEnd w:id="99"/>
-    <w:bookmarkStart w:id="100" w:name="bri-as-asymmetric-interdependence"/>
+    <w:bookmarkEnd w:id="183"/>
+    <w:bookmarkStart w:id="184" w:name="bri-as-asymmetric-interdependence"/>
     <w:p>
       <w:pPr>
         <w:pStyle w:val="Heading2"/>
@@ -1126,8 +1126,8 @@
         <w:t xml:space="preserve">.</w:t>
       </w:r>
     </w:p>
-    <w:bookmarkEnd w:id="100"/>
-    <w:bookmarkStart w:id="101" w:name="kazakhstan-central-asia-and-china"/>
+    <w:bookmarkEnd w:id="184"/>
+    <w:bookmarkStart w:id="185" w:name="kazakhstan-central-asia-and-china"/>
     <w:p>
       <w:pPr>
         <w:pStyle w:val="Heading2"/>
@@ -1303,8 +1303,8 @@
         <w:t xml:space="preserve">: rising mineral exports coincide with rising imports of Chinese capital goods and machinery needed for extraction, rather than supporting domestic value-chain upgrading. The import-category decomposition in §6.4 (HS 84 machinery, HS 85 electronics, HS 87 vehicles) tests this mechanism directly: if these categories exploded disproportionately post-2013, it is consistent with an extractive-infrastructure import channel that drains the trade balance while mineral exports rise.</w:t>
       </w:r>
     </w:p>
-    <w:bookmarkEnd w:id="101"/>
-    <w:bookmarkStart w:id="102" w:name="Xaa0a671067e8fae9f84f9bb9926e7997379c1fb"/>
+    <w:bookmarkEnd w:id="185"/>
+    <w:bookmarkStart w:id="186" w:name="Xaa0a671067e8fae9f84f9bb9926e7997379c1fb"/>
     <w:p>
       <w:pPr>
         <w:pStyle w:val="Heading2"/>
@@ -1401,8 +1401,8 @@
         <w:t xml:space="preserve">provided comprehensive influence diagnostic tools that are essential for validating results in the sample sizes encountered in bilateral trade studies.</w:t>
       </w:r>
     </w:p>
-    <w:bookmarkEnd w:id="102"/>
-    <w:bookmarkStart w:id="103" w:name="research-gap"/>
+    <w:bookmarkEnd w:id="186"/>
+    <w:bookmarkStart w:id="187" w:name="research-gap"/>
     <w:p>
       <w:pPr>
         <w:pStyle w:val="Heading2"/>
@@ -1419,9 +1419,9 @@
         <w:t xml:space="preserve">Most BRI studies focus on aggregate trade expansion or infrastructure connectivity. Fewer examine whether resource exports improve the bilateral trade balance of smaller resource-exporting partners. The compositional question—whether mineral export growth translates into external-balance improvement—remains empirically underdeveloped for the Kazakhstan–China case. Moreover, no existing study applies formal influence diagnostics to assess how robust post-BRI trade findings are to individual high-leverage observations. This thesis addresses that gap.</w:t>
       </w:r>
     </w:p>
-    <w:bookmarkEnd w:id="103"/>
-    <w:bookmarkEnd w:id="104"/>
-    <w:bookmarkStart w:id="110" w:name="theoretical-framework"/>
+    <w:bookmarkEnd w:id="187"/>
+    <w:bookmarkEnd w:id="188"/>
+    <w:bookmarkStart w:id="194" w:name="theoretical-framework"/>
     <w:p>
       <w:pPr>
         <w:pStyle w:val="Heading1"/>
@@ -1430,7 +1430,7 @@
         <w:t xml:space="preserve">3. Theoretical Framework</w:t>
       </w:r>
     </w:p>
-    <w:bookmarkStart w:id="105" w:name="X480a36025e6dac0021a01c966cd8f0ab186890e"/>
+    <w:bookmarkStart w:id="189" w:name="X480a36025e6dac0021a01c966cd8f0ab186890e"/>
     <w:p>
       <w:pPr>
         <w:pStyle w:val="Heading2"/>
@@ -1598,8 +1598,8 @@
         <w:t xml:space="preserve">(§3.3). The critical difference is falsifiability: asymmetric interdependence generates variable-level predictions that can be tested in regression models (§3.4), whereas dependency theory operates at the level of structural formations and does not readily produce falsifiable coefficient predictions. The empirical strategy in this thesis is built entirely on the asymmetric interdependence framework.</w:t>
       </w:r>
     </w:p>
-    <w:bookmarkEnd w:id="105"/>
-    <w:bookmarkStart w:id="106" w:name="supporting-frameworks"/>
+    <w:bookmarkEnd w:id="189"/>
+    <w:bookmarkStart w:id="190" w:name="supporting-frameworks"/>
     <w:p>
       <w:pPr>
         <w:pStyle w:val="Heading2"/>
@@ -1734,8 +1734,8 @@
         <w:t xml:space="preserve">show that captive supplier positions in raw-material chains provide little upgrading leverage. For this model, the minerals–post-BRI interaction term tests whether mineral export growth translates into trade-balance improvement or whether raw-mineral export growth coincides with rising imports of Chinese capital goods and intermediates, consistent with a captive supplier relationship that generates asymmetric gains.</w:t>
       </w:r>
     </w:p>
-    <w:bookmarkEnd w:id="106"/>
-    <w:bookmarkStart w:id="107" w:name="why-not-dependency-theory"/>
+    <w:bookmarkEnd w:id="190"/>
+    <w:bookmarkStart w:id="191" w:name="why-not-dependency-theory"/>
     <w:p>
       <w:pPr>
         <w:pStyle w:val="Heading2"/>
@@ -1779,8 +1779,8 @@
         <w:t xml:space="preserve">), making it a weaker anchor for regression-based analysis. The thesis therefore uses asymmetric interdependence as the testable mechanism and treats dependency theory as background context.</w:t>
       </w:r>
     </w:p>
-    <w:bookmarkEnd w:id="107"/>
-    <w:bookmarkStart w:id="108" w:name="X01d3111613de9dc51f05c1583f96834d5ee4b59"/>
+    <w:bookmarkEnd w:id="191"/>
+    <w:bookmarkStart w:id="192" w:name="X01d3111613de9dc51f05c1583f96834d5ee4b59"/>
     <w:p>
       <w:pPr>
         <w:pStyle w:val="Heading2"/>
@@ -2615,8 +2615,8 @@
         <w:t xml:space="preserve">Note: The primary specification uses GDP growth rates (d.log) following multicollinearity diagnostics (§6.3). The gravity-ratio specification is retained as a robustness check. Both GDP-levels specifications are retained in Appendix B for transparency.</w:t>
       </w:r>
     </w:p>
-    <w:bookmarkEnd w:id="108"/>
-    <w:bookmarkStart w:id="109" w:name="testable-hypotheses"/>
+    <w:bookmarkEnd w:id="192"/>
+    <w:bookmarkStart w:id="193" w:name="testable-hypotheses"/>
     <w:p>
       <w:pPr>
         <w:pStyle w:val="Heading2"/>
@@ -2687,9 +2687,9 @@
         <w:t xml:space="preserve">The post-BRI × minerals interaction is negative, indicating that the trade-balance payoff of mineral exports weakened after BRI corridor deepening. Mechanism: asymmetric interdependence deepening — rising Chinese manufactured exports and the expansion of import-intensive infrastructure financing outpace the revenue gains from mineral exports, producing a deteriorating bilateral position despite export growth. A negative interaction is interpreted as diagnostic evidence consistent with Hirschman’s dependence mechanism, not as causal proof of a BRI effect.</w:t>
       </w:r>
     </w:p>
-    <w:bookmarkEnd w:id="109"/>
-    <w:bookmarkEnd w:id="110"/>
-    <w:bookmarkStart w:id="126" w:name="data-and-variables"/>
+    <w:bookmarkEnd w:id="193"/>
+    <w:bookmarkEnd w:id="194"/>
+    <w:bookmarkStart w:id="210" w:name="data-and-variables"/>
     <w:p>
       <w:pPr>
         <w:pStyle w:val="Heading1"/>
@@ -2698,7 +2698,7 @@
         <w:t xml:space="preserve">4. Data and Variables</w:t>
       </w:r>
     </w:p>
-    <w:bookmarkStart w:id="111" w:name="data-sources-and-panel-construction"/>
+    <w:bookmarkStart w:id="195" w:name="data-sources-and-panel-construction"/>
     <w:p>
       <w:pPr>
         <w:pStyle w:val="Heading2"/>
@@ -3621,8 +3621,8 @@
         <w:t xml:space="preserve">for full variable definitions.</w:t>
       </w:r>
     </w:p>
-    <w:bookmarkEnd w:id="111"/>
-    <w:bookmarkStart w:id="112" w:name="variable-definitions"/>
+    <w:bookmarkEnd w:id="195"/>
+    <w:bookmarkStart w:id="196" w:name="variable-definitions"/>
     <w:p>
       <w:pPr>
         <w:pStyle w:val="Heading2"/>
@@ -3795,8 +3795,8 @@
         <w:t xml:space="preserve">Brent crude oil price (USD/bbl), KZT/USD exchange rate, log Kazakhstan GDP (constant 2015 USD), log China GDP (constant 2015 USD).</w:t>
       </w:r>
     </w:p>
-    <w:bookmarkEnd w:id="112"/>
-    <w:bookmarkStart w:id="113" w:name="measurement-break-in-mineral-data"/>
+    <w:bookmarkEnd w:id="196"/>
+    <w:bookmarkStart w:id="197" w:name="measurement-break-in-mineral-data"/>
     <w:p>
       <w:pPr>
         <w:pStyle w:val="Heading2"/>
@@ -3988,8 +3988,8 @@
         <w:t xml:space="preserve">This break means that the post-BRI structural break detected in regression could partly reflect measurement-source switching rather than genuine economic change. Consequently, researchers must avoid overclaiming from the narrow mineral variable alone. A robustness check using the WITS Ores and Metals series consistently for the full 2000–2023 period (Section 6.6) is therefore essential, not optional, for validating the findings.</w:t>
       </w:r>
     </w:p>
-    <w:bookmarkEnd w:id="113"/>
-    <w:bookmarkStart w:id="114" w:name="b-data-validation-via-web-scraping"/>
+    <w:bookmarkEnd w:id="197"/>
+    <w:bookmarkStart w:id="198" w:name="b-data-validation-via-web-scraping"/>
     <w:p>
       <w:pPr>
         <w:pStyle w:val="Heading2"/>
@@ -4482,8 +4482,8 @@
         <w:t xml:space="preserve">All discrepancies are below 0.5% — well within the &lt; 10% threshold for validation support. This confirms that the trade values used in the analytical panel are consistent with Kazakhstan’s national statistical authority’s official figures. The 2023 import figure (USD 16.772 billion in the panel vs. USD 16.758 billion scraped, a difference of USD 14 million on a USD 16.8 billion total) is the most important validation given that 2023 is the most influential observation in the regression analysis.</w:t>
       </w:r>
     </w:p>
-    <w:bookmarkEnd w:id="114"/>
-    <w:bookmarkStart w:id="124" w:name="X05c1fb1c8c602400de8894489ddedb36501cd2f"/>
+    <w:bookmarkEnd w:id="198"/>
+    <w:bookmarkStart w:id="208" w:name="X05c1fb1c8c602400de8894489ddedb36501cd2f"/>
     <w:p>
       <w:pPr>
         <w:pStyle w:val="Heading2"/>
@@ -4912,18 +4912,18 @@
           <wp:inline>
             <wp:extent cx="5727700" cy="3173752"/>
             <wp:effectExtent b="0" l="0" r="0" t="0"/>
-            <wp:docPr descr="Figure 1. Kazakhstan Exports to China vs Imports from China (2000–2023)" title="" id="116" name="Picture"/>
+            <wp:docPr descr="Figure 1. Kazakhstan Exports to China vs Imports from China (2000–2023)" title="" id="200" name="Picture"/>
             <a:graphic>
               <a:graphicData uri="http://schemas.openxmlformats.org/drawingml/2006/picture">
                 <pic:pic>
                   <pic:nvPicPr>
-                    <pic:cNvPr descr="../Outputs/generated_figures/fig_1_exports_imports.png" id="117" name="Picture"/>
+                    <pic:cNvPr descr="../Outputs/generated_figures/fig_1_exports_imports.png" id="201" name="Picture"/>
                     <pic:cNvPicPr>
                       <a:picLocks noChangeArrowheads="1" noChangeAspect="1"/>
                     </pic:cNvPicPr>
                   </pic:nvPicPr>
                   <pic:blipFill>
-                    <a:blip r:embed="rId115"/>
+                    <a:blip r:embed="rId199"/>
                     <a:stretch>
                       <a:fillRect/>
                     </a:stretch>
@@ -4969,18 +4969,18 @@
           <wp:inline>
             <wp:extent cx="5727700" cy="3215707"/>
             <wp:effectExtent b="0" l="0" r="0" t="0"/>
-            <wp:docPr descr="Figure 2. Kazakhstan–China Bilateral Trade Balance (2000–2023)" title="" id="119" name="Picture"/>
+            <wp:docPr descr="Figure 2. Kazakhstan–China Bilateral Trade Balance (2000–2023)" title="" id="203" name="Picture"/>
             <a:graphic>
               <a:graphicData uri="http://schemas.openxmlformats.org/drawingml/2006/picture">
                 <pic:pic>
                   <pic:nvPicPr>
-                    <pic:cNvPr descr="../Outputs/generated_figures/fig_2_trade_balance.png" id="120" name="Picture"/>
+                    <pic:cNvPr descr="../Outputs/generated_figures/fig_2_trade_balance.png" id="204" name="Picture"/>
                     <pic:cNvPicPr>
                       <a:picLocks noChangeArrowheads="1" noChangeAspect="1"/>
                     </pic:cNvPicPr>
                   </pic:nvPicPr>
                   <pic:blipFill>
-                    <a:blip r:embed="rId118"/>
+                    <a:blip r:embed="rId202"/>
                     <a:stretch>
                       <a:fillRect/>
                     </a:stretch>
@@ -5026,18 +5026,18 @@
           <wp:inline>
             <wp:extent cx="5727700" cy="3268450"/>
             <wp:effectExtent b="0" l="0" r="0" t="0"/>
-            <wp:docPr descr="Figure 3. Strategic Mineral Exports to China (2000–2023)" title="" id="122" name="Picture"/>
+            <wp:docPr descr="Figure 3. Strategic Mineral Exports to China (2000–2023)" title="" id="206" name="Picture"/>
             <a:graphic>
               <a:graphicData uri="http://schemas.openxmlformats.org/drawingml/2006/picture">
                 <pic:pic>
                   <pic:nvPicPr>
-                    <pic:cNvPr descr="../Outputs/generated_figures/fig_3_minerals.png" id="123" name="Picture"/>
+                    <pic:cNvPr descr="../Outputs/generated_figures/fig_3_minerals.png" id="207" name="Picture"/>
                     <pic:cNvPicPr>
                       <a:picLocks noChangeArrowheads="1" noChangeAspect="1"/>
                     </pic:cNvPicPr>
                   </pic:nvPicPr>
                   <pic:blipFill>
-                    <a:blip r:embed="rId121"/>
+                    <a:blip r:embed="rId205"/>
                     <a:stretch>
                       <a:fillRect/>
                     </a:stretch>
@@ -5416,8 +5416,8 @@
         <w:t xml:space="preserve">The decomposition reveals that the trade-balance deterioration is driven by import-side deepening. Imports from China nearly doubled (+94.3%), while exports grew modestly (+24.3%). Strategic mineral exports grew by 29.2%, but this growth was insufficient to offset the import surge. The year 2023 is exceptional: it is the only year in the sample in which Kazakhstan recorded a bilateral trade deficit (−USD 2.01 billion), driven by imports of USD 16.77 billion exceeding exports of USD 14.76 billion.</w:t>
       </w:r>
     </w:p>
-    <w:bookmarkEnd w:id="124"/>
-    <w:bookmarkStart w:id="125" w:name="Xed3cfd76b734a5763902fe68e9f253af1d61968"/>
+    <w:bookmarkEnd w:id="208"/>
+    <w:bookmarkStart w:id="209" w:name="Xed3cfd76b734a5763902fe68e9f253af1d61968"/>
     <w:p>
       <w:pPr>
         <w:pStyle w:val="Heading2"/>
@@ -5434,9 +5434,9 @@
         <w:t xml:space="preserve">Oil and energy exports (HS 2709, 2710, 2711, 2701) constitute approximately 60% of Kazakhstan’s total export revenues. These are absent from the current dataset because bilateral HS-level oil export data for Kazakhstan–China were not available for the full sample period. This is a major limitation. The mineral coefficient may partly capture broader commodity-cycle dynamics rather than the isolated contribution of strategic minerals. The direction of omitted variable bias is ambiguous: oil exports are positively correlated with both minerals and trade balance, so their exclusion may bias the mineral coefficient upward while simultaneously affecting the interaction term. Future research with HS-level energy data should treat oil exports as a separate control.</w:t>
       </w:r>
     </w:p>
-    <w:bookmarkEnd w:id="125"/>
-    <w:bookmarkEnd w:id="126"/>
-    <w:bookmarkStart w:id="131" w:name="empirical-strategy"/>
+    <w:bookmarkEnd w:id="209"/>
+    <w:bookmarkEnd w:id="210"/>
+    <w:bookmarkStart w:id="215" w:name="empirical-strategy"/>
     <w:p>
       <w:pPr>
         <w:pStyle w:val="Heading1"/>
@@ -5445,7 +5445,7 @@
         <w:t xml:space="preserve">5. Empirical Strategy</w:t>
       </w:r>
     </w:p>
-    <w:bookmarkStart w:id="127" w:name="baseline-ols-association-model"/>
+    <w:bookmarkStart w:id="211" w:name="baseline-ols-association-model"/>
     <w:p>
       <w:pPr>
         <w:pStyle w:val="Heading2"/>
@@ -6316,8 +6316,8 @@
         <w:t xml:space="preserve">only where the DiD partner-placebo estimate (§6.5), the synthetic counterfactual gap (§6.6), and the sanctions-robustness check (§6.4) all point in the same direction.</w:t>
       </w:r>
     </w:p>
-    <w:bookmarkEnd w:id="127"/>
-    <w:bookmarkStart w:id="128" w:name="X4e046d0ff3d9cc655891615677fc27b4e01d2f4"/>
+    <w:bookmarkEnd w:id="211"/>
+    <w:bookmarkStart w:id="212" w:name="X4e046d0ff3d9cc655891615677fc27b4e01d2f4"/>
     <w:p>
       <w:pPr>
         <w:pStyle w:val="Heading2"/>
@@ -6465,8 +6465,8 @@
         <w:t xml:space="preserve">The growth-rate specification is the primary model because it is the only specification that substantially meets the VIF &lt; 10 collinearity threshold (§6.3). Coefficient direction and approximate magnitude are consistent across all full-sample specifications (B and C), supporting the directional interpretation, while exact magnitudes should not be over-interpreted given residual collinearity in Scheme C.</w:t>
       </w:r>
     </w:p>
-    <w:bookmarkEnd w:id="128"/>
-    <w:bookmarkStart w:id="129" w:name="adl-dynamic-association-model"/>
+    <w:bookmarkEnd w:id="212"/>
+    <w:bookmarkStart w:id="213" w:name="adl-dynamic-association-model"/>
     <w:p>
       <w:pPr>
         <w:pStyle w:val="Heading2"/>
@@ -7209,8 +7209,8 @@
         <w:t xml:space="preserve">, the bounds test is applied to assess cointegration. If the PSS F-statistic falls below the upper bound, the results are interpreted as short-run dynamic associations rather than long-run equilibrium estimates.</w:t>
       </w:r>
     </w:p>
-    <w:bookmarkEnd w:id="129"/>
-    <w:bookmarkStart w:id="130" w:name="robustness-strategy"/>
+    <w:bookmarkEnd w:id="213"/>
+    <w:bookmarkStart w:id="214" w:name="robustness-strategy"/>
     <w:p>
       <w:pPr>
         <w:pStyle w:val="Heading2"/>
@@ -7227,9 +7227,9 @@
         <w:t xml:space="preserve">Robustness is assessed through: (i) a 288-specification grid varying mineral measures (narrow/broad), BRI variables (dummy/intensity), lag structures, and estimators; (ii) leave-one-out coefficient stability analysis; (iii) WITS-consistent mineral proxy for the full 2000–2023 period; (iv) exclusion of 2023.</w:t>
       </w:r>
     </w:p>
-    <w:bookmarkEnd w:id="130"/>
-    <w:bookmarkEnd w:id="131"/>
-    <w:bookmarkStart w:id="172" w:name="results"/>
+    <w:bookmarkEnd w:id="214"/>
+    <w:bookmarkEnd w:id="215"/>
+    <w:bookmarkStart w:id="256" w:name="results"/>
     <w:p>
       <w:pPr>
         <w:pStyle w:val="Heading1"/>
@@ -7238,7 +7238,7 @@
         <w:t xml:space="preserve">6. Results</w:t>
       </w:r>
     </w:p>
-    <w:bookmarkStart w:id="135" w:name="baseline-ols-results"/>
+    <w:bookmarkStart w:id="219" w:name="baseline-ols-results"/>
     <w:p>
       <w:pPr>
         <w:pStyle w:val="Heading2"/>
@@ -8526,18 +8526,18 @@
           <wp:inline>
             <wp:extent cx="5727700" cy="4485806"/>
             <wp:effectExtent b="0" l="0" r="0" t="0"/>
-            <wp:docPr descr="Figure 4. Strategic Mineral Exports vs Bilateral Trade Balance, Pre-BRI vs Post-BRI" title="" id="133" name="Picture"/>
+            <wp:docPr descr="Figure 4. Strategic Mineral Exports vs Bilateral Trade Balance, Pre-BRI vs Post-BRI" title="" id="217" name="Picture"/>
             <a:graphic>
               <a:graphicData uri="http://schemas.openxmlformats.org/drawingml/2006/picture">
                 <pic:pic>
                   <pic:nvPicPr>
-                    <pic:cNvPr descr="../Outputs/generated_figures/fig_4_scatter.png" id="134" name="Picture"/>
+                    <pic:cNvPr descr="../Outputs/generated_figures/fig_4_scatter.png" id="218" name="Picture"/>
                     <pic:cNvPicPr>
                       <a:picLocks noChangeArrowheads="1" noChangeAspect="1"/>
                     </pic:cNvPicPr>
                   </pic:nvPicPr>
                   <pic:blipFill>
-                    <a:blip r:embed="rId132"/>
+                    <a:blip r:embed="rId216"/>
                     <a:stretch>
                       <a:fillRect/>
                     </a:stretch>
@@ -8574,8 +8574,8 @@
         <w:t xml:space="preserve">Source: Author’s construction. Figure 4 plots the relationship between mineral exports and the trade balance across the two periods, visualising the weakened association post-BRI.</w:t>
       </w:r>
     </w:p>
-    <w:bookmarkEnd w:id="135"/>
-    <w:bookmarkStart w:id="136" w:name="residual-diagnostics"/>
+    <w:bookmarkEnd w:id="219"/>
+    <w:bookmarkStart w:id="220" w:name="residual-diagnostics"/>
     <w:p>
       <w:pPr>
         <w:pStyle w:val="Heading2"/>
@@ -8779,8 +8779,8 @@
         <w:t xml:space="preserve">= 0.006), which motivates the use of HAC standard errors throughout. HAC standard errors correct for both heteroskedasticity and autocorrelation in inference, but do not address potential model misspecification. The Durbin–Watson statistic (1.80) is close to 2.0, suggesting that serial correlation is mild after conditioning on regressors.</w:t>
       </w:r>
     </w:p>
-    <w:bookmarkEnd w:id="136"/>
-    <w:bookmarkStart w:id="137" w:name="X104a27e6e71d30820852bbe2a04f72c58877c53"/>
+    <w:bookmarkEnd w:id="220"/>
+    <w:bookmarkStart w:id="221" w:name="X104a27e6e71d30820852bbe2a04f72c58877c53"/>
     <w:p>
       <w:pPr>
         <w:pStyle w:val="Heading2"/>
@@ -10645,8 +10645,8 @@
         <w:t xml:space="preserve">The POST variable retains VIF = 10.4, just above the conventional threshold of 10. This is because the post-BRI dummy is correlated with the trend component in GDP growth rates post-2013. Coefficient magnitudes in Scheme B should still be interpreted directionally rather than as precise structural parameters, but the reduced collinearity severity relative to Schemes A and C substantially improves inference reliability.</w:t>
       </w:r>
     </w:p>
-    <w:bookmarkEnd w:id="137"/>
-    <w:bookmarkStart w:id="138" w:name="Xbc1dfb7dc1890ac5bda4e89de7eb28a12192bb5"/>
+    <w:bookmarkEnd w:id="221"/>
+    <w:bookmarkStart w:id="222" w:name="Xbc1dfb7dc1890ac5bda4e89de7eb28a12192bb5"/>
     <w:p>
       <w:pPr>
         <w:pStyle w:val="Heading2"/>
@@ -11713,8 +11713,8 @@
         <w:t xml:space="preserve">The negative interaction is not a stable structural finding. Rather, 2023 represents a potential inflection point—the first year of bilateral deficit—that dramatically amplifies the estimated post-BRI deterioration. The thesis interprets the evidence as diagnostic: the data are consistent with an increasingly adverse trade-balance pattern, but the statistical evidence for a systematic post-BRI interaction effect depends on whether 2023 represents the beginning of a new structural pattern or a one-time shock.</w:t>
       </w:r>
     </w:p>
-    <w:bookmarkEnd w:id="138"/>
-    <w:bookmarkStart w:id="142" w:name="leave-one-out-coefficient-stability"/>
+    <w:bookmarkEnd w:id="222"/>
+    <w:bookmarkStart w:id="226" w:name="leave-one-out-coefficient-stability"/>
     <w:p>
       <w:pPr>
         <w:pStyle w:val="Heading2"/>
@@ -11732,18 +11732,18 @@
           <wp:inline>
             <wp:extent cx="5727700" cy="4413041"/>
             <wp:effectExtent b="0" l="0" r="0" t="0"/>
-            <wp:docPr descr="Figure 5. Influence and Leave-One-Out Diagnostics" title="" id="140" name="Picture"/>
+            <wp:docPr descr="Figure 5. Influence and Leave-One-Out Diagnostics" title="" id="224" name="Picture"/>
             <a:graphic>
               <a:graphicData uri="http://schemas.openxmlformats.org/drawingml/2006/picture">
                 <pic:pic>
                   <pic:nvPicPr>
-                    <pic:cNvPr descr="../Outputs/generated_figures/fig_5_diagnostics.png" id="141" name="Picture"/>
+                    <pic:cNvPr descr="../Outputs/generated_figures/fig_5_diagnostics.png" id="225" name="Picture"/>
                     <pic:cNvPicPr>
                       <a:picLocks noChangeArrowheads="1" noChangeAspect="1"/>
                     </pic:cNvPicPr>
                   </pic:nvPicPr>
                   <pic:blipFill>
-                    <a:blip r:embed="rId139"/>
+                    <a:blip r:embed="rId223"/>
                     <a:stretch>
                       <a:fillRect/>
                     </a:stretch>
@@ -11788,8 +11788,8 @@
         <w:t xml:space="preserve">Figure 5 plots the influence diagnostics, including the interaction coefficient from 24 leave-one-out regressions in panel (d). Excluding any year other than 2023 produces interaction coefficients between −2.64 and −3.88, all statistically significant at the 5% level. Excluding 2023 alone reduces the coefficient to −0.41 and renders it insignificant. This confirms that the full-sample result is robust to all observations except 2023.</w:t>
       </w:r>
     </w:p>
-    <w:bookmarkEnd w:id="142"/>
-    <w:bookmarkStart w:id="143" w:name="wits-consistent-proxy-robustness"/>
+    <w:bookmarkEnd w:id="226"/>
+    <w:bookmarkStart w:id="227" w:name="wits-consistent-proxy-robustness"/>
     <w:p>
       <w:pPr>
         <w:pStyle w:val="Heading2"/>
@@ -11832,8 +11832,8 @@
         <w:t xml:space="preserve">= 0.083) excluding 2023—marginally significant. This suggests that measurement consistency partially mitigates the 2023 sensitivity, though the interaction remains fragile.</w:t>
       </w:r>
     </w:p>
-    <w:bookmarkEnd w:id="143"/>
-    <w:bookmarkStart w:id="150" w:name="adl-dynamic-association-results"/>
+    <w:bookmarkEnd w:id="227"/>
+    <w:bookmarkStart w:id="234" w:name="adl-dynamic-association-results"/>
     <w:p>
       <w:pPr>
         <w:pStyle w:val="Heading2"/>
@@ -11912,18 +11912,18 @@
           <wp:inline>
             <wp:extent cx="5727700" cy="1909233"/>
             <wp:effectExtent b="0" l="0" r="0" t="0"/>
-            <wp:docPr descr="Figure 6a. CUSUM Test — Model A (Post-BRI Dummy)" title="" id="145" name="Picture"/>
+            <wp:docPr descr="Figure 6a. CUSUM Test — Model A (Post-BRI Dummy)" title="" id="229" name="Picture"/>
             <a:graphic>
               <a:graphicData uri="http://schemas.openxmlformats.org/drawingml/2006/picture">
                 <pic:pic>
                   <pic:nvPicPr>
-                    <pic:cNvPr descr="../Outputs/generated_figures/fig06_cusum_Model_A_dummy.png" id="146" name="Picture"/>
+                    <pic:cNvPr descr="../Outputs/generated_figures/fig06_cusum_Model_A_dummy.png" id="230" name="Picture"/>
                     <pic:cNvPicPr>
                       <a:picLocks noChangeArrowheads="1" noChangeAspect="1"/>
                     </pic:cNvPicPr>
                   </pic:nvPicPr>
                   <pic:blipFill>
-                    <a:blip r:embed="rId144"/>
+                    <a:blip r:embed="rId228"/>
                     <a:stretch>
                       <a:fillRect/>
                     </a:stretch>
@@ -11991,18 +11991,18 @@
           <wp:inline>
             <wp:extent cx="5727700" cy="1909233"/>
             <wp:effectExtent b="0" l="0" r="0" t="0"/>
-            <wp:docPr descr="Figure 6b. CUSUMSQ Test — Model A (Post-BRI Dummy)" title="" id="148" name="Picture"/>
+            <wp:docPr descr="Figure 6b. CUSUMSQ Test — Model A (Post-BRI Dummy)" title="" id="232" name="Picture"/>
             <a:graphic>
               <a:graphicData uri="http://schemas.openxmlformats.org/drawingml/2006/picture">
                 <pic:pic>
                   <pic:nvPicPr>
-                    <pic:cNvPr descr="../Outputs/generated_figures/fig07_cusum_Model_B_intensity.png" id="149" name="Picture"/>
+                    <pic:cNvPr descr="../Outputs/generated_figures/fig07_cusum_Model_B_intensity.png" id="233" name="Picture"/>
                     <pic:cNvPicPr>
                       <a:picLocks noChangeArrowheads="1" noChangeAspect="1"/>
                     </pic:cNvPicPr>
                   </pic:nvPicPr>
                   <pic:blipFill>
-                    <a:blip r:embed="rId147"/>
+                    <a:blip r:embed="rId231"/>
                     <a:stretch>
                       <a:fillRect/>
                     </a:stretch>
@@ -12069,8 +12069,8 @@
         <w:t xml:space="preserve">Model B (BRI intensity) yields numerically unstable long-run multipliers (magnitudes exceeding 1,000), indicating near-singular estimation. This specification is unreliable and is not used for substantive interpretation.</w:t>
       </w:r>
     </w:p>
-    <w:bookmarkEnd w:id="150"/>
-    <w:bookmarkStart w:id="154" w:name="robustness-grid-summary"/>
+    <w:bookmarkEnd w:id="234"/>
+    <w:bookmarkStart w:id="238" w:name="robustness-grid-summary"/>
     <w:p>
       <w:pPr>
         <w:pStyle w:val="Heading2"/>
@@ -12328,18 +12328,18 @@
           <wp:inline>
             <wp:extent cx="5727700" cy="3431639"/>
             <wp:effectExtent b="0" l="0" r="0" t="0"/>
-            <wp:docPr descr="Figure 6. Model Comparison and Robustness" title="" id="152" name="Picture"/>
+            <wp:docPr descr="Figure 6. Model Comparison and Robustness" title="" id="236" name="Picture"/>
             <a:graphic>
               <a:graphicData uri="http://schemas.openxmlformats.org/drawingml/2006/picture">
                 <pic:pic>
                   <pic:nvPicPr>
-                    <pic:cNvPr descr="../Outputs/generated_figures/fig_6_pre_post.png" id="153" name="Picture"/>
+                    <pic:cNvPr descr="../Outputs/generated_figures/fig_6_pre_post.png" id="237" name="Picture"/>
                     <pic:cNvPicPr>
                       <a:picLocks noChangeArrowheads="1" noChangeAspect="1"/>
                     </pic:cNvPicPr>
                   </pic:nvPicPr>
                   <pic:blipFill>
-                    <a:blip r:embed="rId151"/>
+                    <a:blip r:embed="rId235"/>
                     <a:stretch>
                       <a:fillRect/>
                     </a:stretch>
@@ -12384,8 +12384,8 @@
         <w:t xml:space="preserve">While 82.6% of the converged specifications yielded a negative and significant interaction, this consistency reflects the fact that most specifications include the 2023 observation. The grid confirms that the full-sample negative association is computationally robust across model types, but as demonstrated in Section 6.4, it remains fundamentally fragile to the exclusion of a single year.</w:t>
       </w:r>
     </w:p>
-    <w:bookmarkEnd w:id="154"/>
-    <w:bookmarkStart w:id="155" w:name="X02d2069ce5f5d6c121cab1de71057756545adc1"/>
+    <w:bookmarkEnd w:id="238"/>
+    <w:bookmarkStart w:id="239" w:name="X02d2069ce5f5d6c121cab1de71057756545adc1"/>
     <w:p>
       <w:pPr>
         <w:pStyle w:val="Heading2"/>
@@ -12486,8 +12486,8 @@
         <w:t xml:space="preserve">= 24 with 6 parameters offers limited degrees of freedom. The most defensible interpretation is qualitative: the trade-balance payoff of mineral exports appears to have weakened in the post-BRI period, driven primarily by the extreme 2023 outcome.</w:t>
       </w:r>
     </w:p>
-    <w:bookmarkEnd w:id="155"/>
-    <w:bookmarkStart w:id="158" w:name="Xedb9b08c4672051231fad683c8263bcd7143a2a"/>
+    <w:bookmarkEnd w:id="239"/>
+    <w:bookmarkStart w:id="242" w:name="Xedb9b08c4672051231fad683c8263bcd7143a2a"/>
     <w:p>
       <w:pPr>
         <w:pStyle w:val="Heading2"/>
@@ -12504,7 +12504,7 @@
         <w:t xml:space="preserve">The model does not achieve causal identification. Endogeneity concerns warrant explicit acknowledgement:</w:t>
       </w:r>
     </w:p>
-    <w:bookmarkStart w:id="156" w:name="Xfaa6a9c61f25d443ecdf66c7dab5526d2ab8555"/>
+    <w:bookmarkStart w:id="240" w:name="Xfaa6a9c61f25d443ecdf66c7dab5526d2ab8555"/>
     <w:p>
       <w:pPr>
         <w:pStyle w:val="Heading3"/>
@@ -12547,8 +12547,8 @@
         <w:t xml:space="preserve">While the model includes the Brent crude price as a control, Brent only captures global oil-price movements, not the specific volume of Kazakhstan’s bilateral oil exports to China. Therefore, it only partially mitigates the omitted-variable bias. The mineral coefficient and its interaction term likely absorb broader commodity-export dynamics, including the energy trade. Because the direction and magnitude of omitted oil-export bias cannot be quantified with the current data, the strategic-mineral interpretation is treated as suggestive and bounded by this limitation. This is why the thesis interprets the coefficient as diagnostic evidence of broader trade-balance fragility rather than mineral-specific causal evidence.</w:t>
       </w:r>
     </w:p>
-    <w:bookmarkEnd w:id="156"/>
-    <w:bookmarkStart w:id="157" w:name="other-endogeneity-concerns"/>
+    <w:bookmarkEnd w:id="240"/>
+    <w:bookmarkStart w:id="241" w:name="other-endogeneity-concerns"/>
     <w:p>
       <w:pPr>
         <w:pStyle w:val="Heading3"/>
@@ -12628,9 +12628,9 @@
         <w:t xml:space="preserve">The robustness strategy—comparing parsimonious and full specifications, testing multiple mineral proxies, and reporting leave-one-out sensitivity—partially addresses these concerns by showing which results are robust to specification changes. However, credible causal identification would require instrumental-variable strategies, quasi-experimental variation, or substantially larger samples.</w:t>
       </w:r>
     </w:p>
-    <w:bookmarkEnd w:id="157"/>
-    <w:bookmarkEnd w:id="158"/>
-    <w:bookmarkStart w:id="159" w:name="hypothesis-evaluation"/>
+    <w:bookmarkEnd w:id="241"/>
+    <w:bookmarkEnd w:id="242"/>
+    <w:bookmarkStart w:id="243" w:name="hypothesis-evaluation"/>
     <w:p>
       <w:pPr>
         <w:pStyle w:val="Heading2"/>
@@ -12910,8 +12910,8 @@
         </w:tc>
       </w:tr>
     </w:tbl>
-    <w:bookmarkEnd w:id="159"/>
-    <w:bookmarkStart w:id="160" w:name="Xc9abbbac6f033c0594f26051954fdebeefafa0a"/>
+    <w:bookmarkEnd w:id="243"/>
+    <w:bookmarkStart w:id="244" w:name="Xc9abbbac6f033c0594f26051954fdebeefafa0a"/>
     <w:p>
       <w:pPr>
         <w:pStyle w:val="Heading2"/>
@@ -13370,8 +13370,8 @@
         <w:t xml:space="preserve">While the interaction term retains its sign and significance under this illustrative proxy control, the lack of real bilateral HS-27 series remains an empirical limitation. Therefore, these results are treated as purely exploratory sensitivity tests rather than main empirical evidence.</w:t>
       </w:r>
     </w:p>
-    <w:bookmarkEnd w:id="160"/>
-    <w:bookmarkStart w:id="161" w:name="placebo-break-year-diagnostics"/>
+    <w:bookmarkEnd w:id="244"/>
+    <w:bookmarkStart w:id="245" w:name="placebo-break-year-diagnostics"/>
     <w:p>
       <w:pPr>
         <w:pStyle w:val="Heading2"/>
@@ -13840,8 +13840,8 @@
         <w:t xml:space="preserve">confounders (2016, 2018) than for separating early-period co-incident shocks. These limitations are fully consistent with the thesis’s broader claim that the evidence is diagnostic rather than causal.</w:t>
       </w:r>
     </w:p>
-    <w:bookmarkEnd w:id="161"/>
-    <w:bookmarkStart w:id="166" w:name="the-20222023-sanctions-evasion-channel"/>
+    <w:bookmarkEnd w:id="245"/>
+    <w:bookmarkStart w:id="250" w:name="the-20222023-sanctions-evasion-channel"/>
     <w:p>
       <w:pPr>
         <w:pStyle w:val="Heading2"/>
@@ -13859,7 +13859,7 @@
           <w:i/>
           <w:iCs/>
         </w:rPr>
-        <w:t xml:space="preserve">This section addresses the professor’s most specific concern: that the 2023 import surge is better explained by Russia-sanctions parallel imports than by BRI structural deepening. Results are produced by</w:t>
+        <w:t xml:space="preserve">Results produced by</w:t>
       </w:r>
       <w:r>
         <w:rPr>
@@ -13881,7 +13881,7 @@
           <w:i/>
           <w:iCs/>
         </w:rPr>
-        <w:t xml:space="preserve">; the full analysis memo is in</w:t>
+        <w:t xml:space="preserve">. Full analysis memo:</w:t>
       </w:r>
       <w:r>
         <w:rPr>
@@ -13906,7 +13906,7 @@
         <w:t xml:space="preserve">.</w:t>
       </w:r>
     </w:p>
-    <w:bookmarkStart w:id="162" w:name="background-and-hypothesis"/>
+    <w:bookmarkStart w:id="246" w:name="background-and-hypothesis"/>
     <w:p>
       <w:pPr>
         <w:pStyle w:val="Heading3"/>
@@ -13944,8 +13944,8 @@
         <w:t xml:space="preserve">If this hypothesis is correct, the 2023 bilateral trade deficit (−USD 2.01 billion) does not indicate a BRI-driven structural deepening of asymmetric interdependence. Instead, it reflects a temporary geopolitical shock that inflated Kazakhstan’s recorded imports from China. This would significantly weaken the causal interpretation of the post-BRI mineral interaction coefficient.</w:t>
       </w:r>
     </w:p>
-    <w:bookmarkEnd w:id="162"/>
-    <w:bookmarkStart w:id="163" w:name="import-surge-magnitude"/>
+    <w:bookmarkEnd w:id="246"/>
+    <w:bookmarkStart w:id="247" w:name="import-surge-magnitude"/>
     <w:p>
       <w:pPr>
         <w:pStyle w:val="Heading3"/>
@@ -13993,7 +13993,7 @@
         <w:t xml:space="preserve"> </w:t>
       </w:r>
       <w:r>
-        <w:t>in the local data. This remains a data limitation: a direct test of whether these categories exploded disproportionately in 2022–2023 is therefore not possible from local data. This gap is documented in</w:t>
+        <w:t xml:space="preserve">in the local data. This remains a data limitation: a direct test of whether these categories exploded disproportionately in 2022–2023 is therefore not possible from local data. This gap is documented in</w:t>
       </w:r>
       <w:r>
         <w:t xml:space="preserve"> </w:t>
@@ -14011,8 +14011,8 @@
         <w:t xml:space="preserve">and would require a new Comtrade API pull (KAZ-reporter, CHN as partner, HS 84/85/87, import flow) to close.</w:t>
       </w:r>
     </w:p>
-    <w:bookmarkEnd w:id="163"/>
-    <w:bookmarkStart w:id="164" w:name="X72f40ba1df561b40a8b38f42c7043abb0541aee"/>
+    <w:bookmarkEnd w:id="247"/>
+    <w:bookmarkStart w:id="248" w:name="X72f40ba1df561b40a8b38f42c7043abb0541aee"/>
     <w:p>
       <w:pPr>
         <w:pStyle w:val="Heading3"/>
@@ -14590,8 +14590,8 @@
         <w:t xml:space="preserve">. HAC (Newey–West) standard errors, bandwidth = 3.</w:t>
       </w:r>
     </w:p>
-    <w:bookmarkEnd w:id="164"/>
-    <w:bookmarkStart w:id="165" w:name="findings-and-interpretation"/>
+    <w:bookmarkEnd w:id="248"/>
+    <w:bookmarkStart w:id="249" w:name="findings-and-interpretation"/>
     <w:p>
       <w:pPr>
         <w:pStyle w:val="Heading3"/>
@@ -14807,9 +14807,9 @@
         <w:t xml:space="preserve">asymmetric interdependence rather than as causal evidence.</w:t>
       </w:r>
     </w:p>
-    <w:bookmarkEnd w:id="165"/>
-    <w:bookmarkEnd w:id="166"/>
-    <w:bookmarkStart w:id="167" w:name="X2fd92483128a5add758ee2b2eb0099452b15daa"/>
+    <w:bookmarkEnd w:id="249"/>
+    <w:bookmarkEnd w:id="250"/>
+    <w:bookmarkStart w:id="251" w:name="X2fd92483128a5add758ee2b2eb0099452b15daa"/>
     <w:p>
       <w:pPr>
         <w:pStyle w:val="Heading2"/>
@@ -15806,8 +15806,8 @@
         <w:t xml:space="preserve">The 2009/2010 marginal placebo significance in the ITS is a within-unit artefact that reflects the pre-existing downward trend in the Kazakhstan–China balance. The TWFE DiD absorbs this trend via year fixed effects and confirms the 2013 break is genuinely China-specific.</w:t>
       </w:r>
     </w:p>
-    <w:bookmarkEnd w:id="167"/>
-    <w:bookmarkStart w:id="171" w:name="synthetic-counterfactual"/>
+    <w:bookmarkEnd w:id="251"/>
+    <w:bookmarkStart w:id="255" w:name="synthetic-counterfactual"/>
     <w:p>
       <w:pPr>
         <w:pStyle w:val="Heading2"/>
@@ -16615,18 +16615,18 @@
           <wp:inline>
             <wp:extent cx="5727700" cy="4165600"/>
             <wp:effectExtent b="0" l="0" r="0" t="0"/>
-            <wp:docPr descr="Figure 7. Synthetic Counterfactual: Actual vs. Synthetic KZ-China Trade Balance Ratio" title="" id="169" name="Picture"/>
+            <wp:docPr descr="Figure 7. Synthetic Counterfactual: Actual vs. Synthetic KZ-China Trade Balance Ratio" title="" id="253" name="Picture"/>
             <a:graphic>
               <a:graphicData uri="http://schemas.openxmlformats.org/drawingml/2006/picture">
                 <pic:pic>
                   <pic:nvPicPr>
-                    <pic:cNvPr descr="../Outputs/generated_figures/fig_synthetic_control.png" id="170" name="Picture"/>
+                    <pic:cNvPr descr="../Outputs/generated_figures/fig_synthetic_control.png" id="254" name="Picture"/>
                     <pic:cNvPicPr>
                       <a:picLocks noChangeArrowheads="1" noChangeAspect="1"/>
                     </pic:cNvPicPr>
                   </pic:nvPicPr>
                   <pic:blipFill>
-                    <a:blip r:embed="rId168"/>
+                    <a:blip r:embed="rId252"/>
                     <a:stretch>
                       <a:fillRect/>
                     </a:stretch>
@@ -17108,9 +17108,9 @@
         <w:t xml:space="preserve">(versus concurrent geopolitical shocks in 2022–2023) cannot be conclusively established. Causal language remains reserved for the DiD finding only; the regression interaction is described as a conditional association.</w:t>
       </w:r>
     </w:p>
-    <w:bookmarkEnd w:id="171"/>
-    <w:bookmarkEnd w:id="172"/>
-    <w:bookmarkStart w:id="177" w:name="discussion"/>
+    <w:bookmarkEnd w:id="255"/>
+    <w:bookmarkEnd w:id="256"/>
+    <w:bookmarkStart w:id="261" w:name="discussion"/>
     <w:p>
       <w:pPr>
         <w:pStyle w:val="Heading1"/>
@@ -17119,7 +17119,7 @@
         <w:t xml:space="preserve">7. Discussion</w:t>
       </w:r>
     </w:p>
-    <w:bookmarkStart w:id="173" w:name="what-the-results-show"/>
+    <w:bookmarkStart w:id="257" w:name="what-the-results-show"/>
     <w:p>
       <w:pPr>
         <w:pStyle w:val="Heading2"/>
@@ -17194,8 +17194,8 @@
         <w:t xml:space="preserve">asymmetric interdependence deepening post-BRI.</w:t>
       </w:r>
     </w:p>
-    <w:bookmarkEnd w:id="173"/>
-    <w:bookmarkStart w:id="174" w:name="what-the-results-do-not-show"/>
+    <w:bookmarkEnd w:id="257"/>
+    <w:bookmarkStart w:id="258" w:name="what-the-results-do-not-show"/>
     <w:p>
       <w:pPr>
         <w:pStyle w:val="Heading2"/>
@@ -17308,8 +17308,8 @@
         <w:t xml:space="preserve">The coefficient should be read as evidence that the trade-balance association of mineral exports weakened in the post-BRI period, not as a causal multiplier. The sanctions robustness check (§6.14) cannot rule out that part or all of the post-2013 interaction is driven by the 2022–2023 Russia-sanctions routing rather than BRI-specific structural deepening.</w:t>
       </w:r>
     </w:p>
-    <w:bookmarkEnd w:id="174"/>
-    <w:bookmarkStart w:id="175" w:name="X159a95f1f75e4cb9d73376d92636dad3144bb28"/>
+    <w:bookmarkEnd w:id="258"/>
+    <w:bookmarkStart w:id="259" w:name="X159a95f1f75e4cb9d73376d92636dad3144bb28"/>
     <w:p>
       <w:pPr>
         <w:pStyle w:val="Heading2"/>
@@ -17334,8 +17334,8 @@
         <w:t xml:space="preserve">However, from an econometric standpoint, 2023 possesses extremely high leverage. Because inference in a 24-observation dataset is fragile, the results must be reported transparently with and without this year. The full-sample interaction coefficient and the excluding-2023 estimates should be treated as co-equal evidence. The core conclusion of this thesis—that the bilateral trade relationship has grown increasingly fragile and asymmetric—is supported by the descriptive decomposition and the 2023 outcome itself, but the formal claim of a stable, systematic post-BRI statistical interaction effect must not depend solely on the full-sample regression coefficient.</w:t>
       </w:r>
     </w:p>
-    <w:bookmarkEnd w:id="175"/>
-    <w:bookmarkStart w:id="176" w:name="policy-implications"/>
+    <w:bookmarkEnd w:id="259"/>
+    <w:bookmarkStart w:id="260" w:name="policy-implications"/>
     <w:p>
       <w:pPr>
         <w:pStyle w:val="Heading2"/>
@@ -17500,9 +17500,9 @@
         <w:t xml:space="preserve">requiring policy response rather than a statistical anomaly.</w:t>
       </w:r>
     </w:p>
-    <w:bookmarkEnd w:id="176"/>
-    <w:bookmarkEnd w:id="177"/>
-    <w:bookmarkStart w:id="180" w:name="conclusion"/>
+    <w:bookmarkEnd w:id="260"/>
+    <w:bookmarkEnd w:id="261"/>
+    <w:bookmarkStart w:id="264" w:name="conclusion"/>
     <w:p>
       <w:pPr>
         <w:pStyle w:val="Heading1"/>
@@ -17572,7 +17572,7 @@
         <w:t xml:space="preserve">The thesis therefore identifies a China-specific, increasingly adverse bilateral pattern that is strongly consistent with asymmetric interdependence theory. The strongest empirical contributions are: the descriptive decomposition showing import-side deepening as the primary mechanism; the TWFE DiD demonstrating China-specificity; and the transparent reporting of regression fragility and influence diagnostics.</w:t>
       </w:r>
     </w:p>
-    <w:bookmarkStart w:id="178" w:name="interpretation-discipline"/>
+    <w:bookmarkStart w:id="262" w:name="interpretation-discipline"/>
     <w:p>
       <w:pPr>
         <w:pStyle w:val="Heading2"/>
@@ -17605,8 +17605,8 @@
         <w:t xml:space="preserve">— not a common shock across trading partners — as demonstrated by the TWFE DiD partner-placebo design (§6.15). It cannot claim that BRI causally worsened Kazakhstan’s trade balance, because the regression interaction does not survive exclusion of the 2022–2023 sanctions period and an alternative explanation via parallel-import routing cannot be ruled out. The TWFE DiD finding is the most causally credible result; the regression interaction is a conditional association.</w:t>
       </w:r>
     </w:p>
-    <w:bookmarkEnd w:id="178"/>
-    <w:bookmarkStart w:id="179" w:name="limitations-and-future-research"/>
+    <w:bookmarkEnd w:id="262"/>
+    <w:bookmarkStart w:id="263" w:name="limitations-and-future-research"/>
     <w:p>
       <w:pPr>
         <w:pStyle w:val="Heading2"/>
@@ -17652,9 +17652,9 @@
         <w:t xml:space="preserve">The finding that mineral export growth did not translate into trade-balance improvement is consistent with the broader resource-dependence literature: export success in raw materials does not automatically improve external balance when the trading partner’s diversified export capacity grows faster. For Kazakhstan and comparable corridor economies, this diagnostic evidence suggests that BRI participation should be evaluated not by aggregate trade volumes but by the composition and balance of bilateral exchange.</w:t>
       </w:r>
     </w:p>
-    <w:bookmarkEnd w:id="179"/>
-    <w:bookmarkEnd w:id="180"/>
-    <w:bookmarkStart w:id="181" w:name="appendix-table-and-figure-concordance"/>
+    <w:bookmarkEnd w:id="263"/>
+    <w:bookmarkEnd w:id="264"/>
+    <w:bookmarkStart w:id="265" w:name="appendix-table-and-figure-concordance"/>
     <w:p>
       <w:pPr>
         <w:pStyle w:val="Heading1"/>
@@ -19166,8 +19166,8 @@
         </w:tc>
       </w:tr>
     </w:tbl>
-    <w:bookmarkEnd w:id="181"/>
-    <w:bookmarkStart w:id="184" w:name="X2a4b41675f3f3c302420f86aae5c9ae3362ae7d"/>
+    <w:bookmarkEnd w:id="265"/>
+    <w:bookmarkStart w:id="268" w:name="X2a4b41675f3f3c302420f86aae5c9ae3362ae7d"/>
     <w:p>
       <w:pPr>
         <w:pStyle w:val="Heading1"/>
@@ -19185,10 +19185,10 @@
           <w:i/>
           <w:iCs/>
         </w:rPr>
-        <w:t xml:space="preserve">This appendix documents the pre-revision OLS specification that used log(KZ GDP) and log(CN GDP) as separate level regressors. It is retained per hard rule 4 (do not delete midterm specifications) and per the explicit midterm revision commitment in §5.2.</w:t>
-      </w:r>
-    </w:p>
-    <w:bookmarkStart w:id="182" w:name="appendix-b.1-pre-revision-full-model-a1"/>
+        <w:t xml:space="preserve">This appendix documents the pre-revision OLS specification that used log(KZ GDP) and log(CN GDP) as separate level regressors. It is retained for transparency, enabling direct comparison between the midterm and final specifications and illustrating how multicollinearity resolution affected the estimates.</w:t>
+      </w:r>
+    </w:p>
+    <w:bookmarkStart w:id="266" w:name="appendix-b.1-pre-revision-full-model-a1"/>
     <w:p>
       <w:pPr>
         <w:pStyle w:val="Heading2"/>
@@ -19750,8 +19750,8 @@
         <w:t xml:space="preserve">Notes: The large constant (197.6), implausible GDP coefficient magnitudes, and max VIF &gt; 100 indicate that this specification’s coefficients absorb trending collinearity rather than identifying genuine partial effects. This specification is superseded by the growth-rate model (Scheme B, primary) and gravity-ratio model (Scheme C, robustness) in the final version.</w:t>
       </w:r>
     </w:p>
-    <w:bookmarkEnd w:id="182"/>
-    <w:bookmarkStart w:id="183" w:name="Xfc43d264906fd36d64ff21af4fbc70df67b82f2"/>
+    <w:bookmarkEnd w:id="266"/>
+    <w:bookmarkStart w:id="267" w:name="Xfc43d264906fd36d64ff21af4fbc70df67b82f2"/>
     <w:p>
       <w:pPr>
         <w:pStyle w:val="Heading2"/>
@@ -20199,8 +20199,8 @@
         <w:t xml:space="preserve">Notes: This specification achieved VIF &lt; 10 by excluding GDP controls entirely. The final primary specification (Scheme B, GDP growth rates) retains GDP-related regressors in stationary form (d.log), achieving max VIF = 10.4. The Scheme C gravity-ratio specification is reported as a robustness check (max VIF = 33.4).</w:t>
       </w:r>
     </w:p>
-    <w:bookmarkEnd w:id="183"/>
-    <w:bookmarkEnd w:id="184"/>
+    <w:bookmarkEnd w:id="267"/>
+    <w:bookmarkEnd w:id="268"/>
     <w:sectPr>
       <w:footerReference r:id="rId9" w:type="default"/>
       <w:footnotePr>

</xml_diff>

<commit_message>
format(paper): proper APA 7th edition layout and clean structure
- Wrote APA CSS: Times New Roman 12pt, double-spaced, 1in margins, correct
  heading hierarchy (centred bold L1, left bold L2, left bold-italic L3),
  APA table rules (horizontal only), hanging-indent references, page numbers
  top-right; suppressed Chrome URL/date footer
- Fixed non-standard section 4.3b → 4.4 (Data Validation); renumbered
  former 4.4 → 4.5 (Descriptive Statistics), 4.5 → 4.6 (Oil Exports)
- Updated concordance table section references; added Table 4.5 entry
- Standardised appendix headings: "Appendix A / Appendix B" (removed
  section number prefix; removed "(Retained for Transparency)" subtitle)
- Rebuilt DOCX from clean default pandoc styles (removed circular
  self-reference template)
</commit_message>
<xml_diff>
--- a/Paper/final_dissertation.docx
+++ b/Paper/final_dissertation.docx
@@ -26,7 +26,7 @@
         <w:t xml:space="preserve">Nikar Omirbek</w:t>
       </w:r>
     </w:p>
-    <w:bookmarkStart w:id="261" w:name="abstract"/>
+    <w:bookmarkStart w:id="9" w:name="abstract"/>
     <w:p>
       <w:pPr>
         <w:pStyle w:val="Heading1"/>
@@ -100,8 +100,8 @@
         <w:t xml:space="preserve">Belt and Road Initiative; Kazakhstan–China trade; strategic minerals; asymmetric interdependence; trade balance; small-sample diagnostics; post-BRI period</w:t>
       </w:r>
     </w:p>
-    <w:bookmarkEnd w:id="261"/>
-    <w:bookmarkStart w:id="264" w:name="introduction"/>
+    <w:bookmarkEnd w:id="9"/>
+    <w:bookmarkStart w:id="12" w:name="introduction"/>
     <w:p>
       <w:pPr>
         <w:pStyle w:val="Heading1"/>
@@ -302,7 +302,7 @@
         <w:t xml:space="preserve">These results are interpreted as strong diagnostic evidence that Kazakhstan’s bilateral trade deterioration post-BRI is China-specific and consistent with asymmetric interdependence deepening. The regression interaction is fragile; the cross-partner identification is robust. The strongest empirical contributions are: (i) the descriptive decomposition showing import-side deepening as the primary mechanism; (ii) the TWFE DiD demonstrating China-specificity; and (iii) transparent reporting of regression fragility.</w:t>
       </w:r>
     </w:p>
-    <w:bookmarkStart w:id="262" w:name="contribution"/>
+    <w:bookmarkStart w:id="10" w:name="contribution"/>
     <w:p>
       <w:pPr>
         <w:pStyle w:val="Heading2"/>
@@ -319,8 +319,8 @@
         <w:t xml:space="preserve">This thesis makes five specific contributions. First, it distinguishes between trade expansion and trade-balance improvement, shifting attention from aggregate trade volumes to bilateral trade-balance outcomes in a diagnostic case study of Kazakhstan and China. Second, it bridges theory and method by using asymmetric interdependence to interpret the moderating compositional channel of strategic mineral exports, accommodating both mutual gains and distributional asymmetry. Third, it tests whether strategic mineral exports translated into external-balance improvement, demonstrating that resource-export growth is not inherently synonymous with an improved external position. Fourth, it provides a transparent and reproducible annual Kazakhstan–China single country-pair dataset with a fully scripted pipeline. Fifth, it treats the results explicitly as diagnostic and fragile, deploying small-sample robustness checks and influence diagnostics to document the critical role of 2023. By providing an honest interpretation of fragility, the thesis strengthens methodological discipline and avoids claiming definitive causal identification of a stable structural effect.</w:t>
       </w:r>
     </w:p>
-    <w:bookmarkEnd w:id="262"/>
-    <w:bookmarkStart w:id="263" w:name="structure"/>
+    <w:bookmarkEnd w:id="10"/>
+    <w:bookmarkStart w:id="11" w:name="structure"/>
     <w:p>
       <w:pPr>
         <w:pStyle w:val="Heading2"/>
@@ -337,9 +337,9 @@
         <w:t xml:space="preserve">The remainder of this thesis is organised as follows. Chapter 2 reviews the literature and identifies the research gap. Chapter 3 presents the theoretical framework. Chapter 4 describes the data, variable construction, and data limitations. Chapter 5 explains the empirical strategy. Chapter 6 presents the results, including influence diagnostics and model stability analysis. Chapter 7 discusses the findings and their implications. Chapter 8 concludes.</w:t>
       </w:r>
     </w:p>
-    <w:bookmarkEnd w:id="263"/>
-    <w:bookmarkEnd w:id="264"/>
-    <w:bookmarkStart w:id="272" w:name="literature-review"/>
+    <w:bookmarkEnd w:id="11"/>
+    <w:bookmarkEnd w:id="12"/>
+    <w:bookmarkStart w:id="20" w:name="literature-review"/>
     <w:p>
       <w:pPr>
         <w:pStyle w:val="Heading1"/>
@@ -356,7 +356,7 @@
         <w:t xml:space="preserve">The literature relevant to Kazakhstan–China trade under BRI spans several overlapping debates. Rather than summarising individual studies, this review synthesises what the literature agrees on, identifies disagreements and limitations, and explains how each strand connects to the research question.</w:t>
       </w:r>
     </w:p>
-    <w:bookmarkStart w:id="265" w:name="X2930bc3edf58adf9f1388ee5b893d7488b5e345"/>
+    <w:bookmarkStart w:id="13" w:name="X2930bc3edf58adf9f1388ee5b893d7488b5e345"/>
     <w:p>
       <w:pPr>
         <w:pStyle w:val="Heading2"/>
@@ -521,8 +521,8 @@
         <w:t xml:space="preserve">interaction in H3.</w:t>
       </w:r>
     </w:p>
-    <w:bookmarkEnd w:id="265"/>
-    <w:bookmarkStart w:id="266" w:name="Xe70771352f1ad036bac85112bc90e3cc68c7f96"/>
+    <w:bookmarkEnd w:id="13"/>
+    <w:bookmarkStart w:id="14" w:name="Xe70771352f1ad036bac85112bc90e3cc68c7f96"/>
     <w:p>
       <w:pPr>
         <w:pStyle w:val="Heading2"/>
@@ -728,8 +728,8 @@
         <w:t xml:space="preserve">on the bilateral balance via the Marshall–Lerner condition.</w:t>
       </w:r>
     </w:p>
-    <w:bookmarkEnd w:id="266"/>
-    <w:bookmarkStart w:id="267" w:name="bri-as-trade-facilitation"/>
+    <w:bookmarkEnd w:id="14"/>
+    <w:bookmarkStart w:id="15" w:name="bri-as-trade-facilitation"/>
     <w:p>
       <w:pPr>
         <w:pStyle w:val="Heading2"/>
@@ -878,8 +878,8 @@
         <w:t xml:space="preserve">period dummy as a partial test of trade-cost reduction, while noting that the dummy conflates BRI-specific effects with concurrent commodity shocks. The comparative DiD design (§6.5) addresses this limitation by testing whether the post-2013 balance shift is China-specific or common across all of Kazakhstan’s trading partners.</w:t>
       </w:r>
     </w:p>
-    <w:bookmarkEnd w:id="267"/>
-    <w:bookmarkStart w:id="268" w:name="bri-as-asymmetric-interdependence"/>
+    <w:bookmarkEnd w:id="15"/>
+    <w:bookmarkStart w:id="16" w:name="bri-as-asymmetric-interdependence"/>
     <w:p>
       <w:pPr>
         <w:pStyle w:val="Heading2"/>
@@ -1144,8 +1144,8 @@
         <w:t xml:space="preserve">.</w:t>
       </w:r>
     </w:p>
-    <w:bookmarkEnd w:id="268"/>
-    <w:bookmarkStart w:id="269" w:name="kazakhstan-central-asia-and-china"/>
+    <w:bookmarkEnd w:id="16"/>
+    <w:bookmarkStart w:id="17" w:name="kazakhstan-central-asia-and-china"/>
     <w:p>
       <w:pPr>
         <w:pStyle w:val="Heading2"/>
@@ -1321,8 +1321,8 @@
         <w:t xml:space="preserve">: rising mineral exports coincide with rising imports of Chinese capital goods and machinery needed for extraction, rather than supporting domestic value-chain upgrading. The import-category decomposition in §6.4 (HS 84 machinery, HS 85 electronics, HS 87 vehicles) tests this mechanism directly: if these categories exploded disproportionately post-2013, it is consistent with an extractive-infrastructure import channel that drains the trade balance while mineral exports rise.</w:t>
       </w:r>
     </w:p>
-    <w:bookmarkEnd w:id="269"/>
-    <w:bookmarkStart w:id="270" w:name="Xaa0a671067e8fae9f84f9bb9926e7997379c1fb"/>
+    <w:bookmarkEnd w:id="17"/>
+    <w:bookmarkStart w:id="18" w:name="Xaa0a671067e8fae9f84f9bb9926e7997379c1fb"/>
     <w:p>
       <w:pPr>
         <w:pStyle w:val="Heading2"/>
@@ -1419,8 +1419,8 @@
         <w:t xml:space="preserve">provided comprehensive influence diagnostic tools that are essential for validating results in the sample sizes encountered in bilateral trade studies.</w:t>
       </w:r>
     </w:p>
-    <w:bookmarkEnd w:id="270"/>
-    <w:bookmarkStart w:id="271" w:name="research-gap"/>
+    <w:bookmarkEnd w:id="18"/>
+    <w:bookmarkStart w:id="19" w:name="research-gap"/>
     <w:p>
       <w:pPr>
         <w:pStyle w:val="Heading2"/>
@@ -1437,9 +1437,9 @@
         <w:t xml:space="preserve">Most BRI studies focus on aggregate trade expansion or infrastructure connectivity. Fewer examine whether resource exports improve the bilateral trade balance of smaller resource-exporting partners. The compositional question—whether mineral export growth translates into external-balance improvement—remains empirically underdeveloped for the Kazakhstan–China case. Moreover, no existing study applies formal influence diagnostics to assess how robust post-BRI trade findings are to individual high-leverage observations. This thesis addresses that gap.</w:t>
       </w:r>
     </w:p>
-    <w:bookmarkEnd w:id="271"/>
-    <w:bookmarkEnd w:id="272"/>
-    <w:bookmarkStart w:id="278" w:name="theoretical-framework"/>
+    <w:bookmarkEnd w:id="19"/>
+    <w:bookmarkEnd w:id="20"/>
+    <w:bookmarkStart w:id="26" w:name="theoretical-framework"/>
     <w:p>
       <w:pPr>
         <w:pStyle w:val="Heading1"/>
@@ -1448,7 +1448,7 @@
         <w:t xml:space="preserve">3. Theoretical Framework</w:t>
       </w:r>
     </w:p>
-    <w:bookmarkStart w:id="273" w:name="X480a36025e6dac0021a01c966cd8f0ab186890e"/>
+    <w:bookmarkStart w:id="21" w:name="X480a36025e6dac0021a01c966cd8f0ab186890e"/>
     <w:p>
       <w:pPr>
         <w:pStyle w:val="Heading2"/>
@@ -1616,8 +1616,8 @@
         <w:t xml:space="preserve">(§3.3). The critical difference is falsifiability: asymmetric interdependence generates variable-level predictions that can be tested in regression models (§3.4), whereas dependency theory operates at the level of structural formations and does not readily produce falsifiable coefficient predictions. The empirical strategy in this thesis is built entirely on the asymmetric interdependence framework.</w:t>
       </w:r>
     </w:p>
-    <w:bookmarkEnd w:id="273"/>
-    <w:bookmarkStart w:id="274" w:name="supporting-frameworks"/>
+    <w:bookmarkEnd w:id="21"/>
+    <w:bookmarkStart w:id="22" w:name="supporting-frameworks"/>
     <w:p>
       <w:pPr>
         <w:pStyle w:val="Heading2"/>
@@ -1752,8 +1752,8 @@
         <w:t xml:space="preserve">show that captive supplier positions in raw-material chains provide little upgrading leverage. For this model, the minerals–post-BRI interaction term tests whether mineral export growth translates into trade-balance improvement or whether raw-mineral export growth coincides with rising imports of Chinese capital goods and intermediates, consistent with a captive supplier relationship that generates asymmetric gains.</w:t>
       </w:r>
     </w:p>
-    <w:bookmarkEnd w:id="274"/>
-    <w:bookmarkStart w:id="275" w:name="why-not-dependency-theory"/>
+    <w:bookmarkEnd w:id="22"/>
+    <w:bookmarkStart w:id="23" w:name="why-not-dependency-theory"/>
     <w:p>
       <w:pPr>
         <w:pStyle w:val="Heading2"/>
@@ -1797,8 +1797,8 @@
         <w:t xml:space="preserve">), making it a weaker anchor for regression-based analysis. The thesis therefore uses asymmetric interdependence as the testable mechanism and treats dependency theory as background context.</w:t>
       </w:r>
     </w:p>
-    <w:bookmarkEnd w:id="275"/>
-    <w:bookmarkStart w:id="276" w:name="X01d3111613de9dc51f05c1583f96834d5ee4b59"/>
+    <w:bookmarkEnd w:id="23"/>
+    <w:bookmarkStart w:id="24" w:name="X01d3111613de9dc51f05c1583f96834d5ee4b59"/>
     <w:p>
       <w:pPr>
         <w:pStyle w:val="Heading2"/>
@@ -2633,8 +2633,8 @@
         <w:t xml:space="preserve">Note: The primary specification uses GDP growth rates (d.log) following multicollinearity diagnostics (§6.3). The gravity-ratio specification is retained as a robustness check. Both GDP-levels specifications are retained in Appendix B for transparency.</w:t>
       </w:r>
     </w:p>
-    <w:bookmarkEnd w:id="276"/>
-    <w:bookmarkStart w:id="277" w:name="testable-hypotheses"/>
+    <w:bookmarkEnd w:id="24"/>
+    <w:bookmarkStart w:id="25" w:name="testable-hypotheses"/>
     <w:p>
       <w:pPr>
         <w:pStyle w:val="Heading2"/>
@@ -2705,9 +2705,9 @@
         <w:t xml:space="preserve">The post-BRI × minerals interaction is negative, indicating that the trade-balance payoff of mineral exports weakened after BRI corridor deepening. Mechanism: asymmetric interdependence deepening — rising Chinese manufactured exports and the expansion of import-intensive infrastructure financing outpace the revenue gains from mineral exports, producing a deteriorating bilateral position despite export growth. A negative interaction is interpreted as diagnostic evidence consistent with Hirschman’s dependence mechanism, not as causal proof of a BRI effect.</w:t>
       </w:r>
     </w:p>
-    <w:bookmarkEnd w:id="277"/>
-    <w:bookmarkEnd w:id="278"/>
-    <w:bookmarkStart w:id="294" w:name="data-and-variables"/>
+    <w:bookmarkEnd w:id="25"/>
+    <w:bookmarkEnd w:id="26"/>
+    <w:bookmarkStart w:id="42" w:name="data-and-variables"/>
     <w:p>
       <w:pPr>
         <w:pStyle w:val="Heading1"/>
@@ -2716,7 +2716,7 @@
         <w:t xml:space="preserve">4. Data and Variables</w:t>
       </w:r>
     </w:p>
-    <w:bookmarkStart w:id="279" w:name="data-sources-and-panel-construction"/>
+    <w:bookmarkStart w:id="27" w:name="data-sources-and-panel-construction"/>
     <w:p>
       <w:pPr>
         <w:pStyle w:val="Heading2"/>
@@ -3572,8 +3572,8 @@
         <w:t xml:space="preserve">Note: Author’s compilation. Full variable definitions are available in the accompanying codebook.</w:t>
       </w:r>
     </w:p>
-    <w:bookmarkEnd w:id="279"/>
-    <w:bookmarkStart w:id="280" w:name="variable-definitions"/>
+    <w:bookmarkEnd w:id="27"/>
+    <w:bookmarkStart w:id="28" w:name="variable-definitions"/>
     <w:p>
       <w:pPr>
         <w:pStyle w:val="Heading2"/>
@@ -3746,8 +3746,8 @@
         <w:t xml:space="preserve">Brent crude oil price (USD/bbl), KZT/USD exchange rate, log Kazakhstan GDP (constant 2015 USD), log China GDP (constant 2015 USD).</w:t>
       </w:r>
     </w:p>
-    <w:bookmarkEnd w:id="280"/>
-    <w:bookmarkStart w:id="281" w:name="measurement-break-in-mineral-data"/>
+    <w:bookmarkEnd w:id="28"/>
+    <w:bookmarkStart w:id="29" w:name="measurement-break-in-mineral-data"/>
     <w:p>
       <w:pPr>
         <w:pStyle w:val="Heading2"/>
@@ -3939,14 +3939,14 @@
         <w:t xml:space="preserve">This break means that the post-BRI structural break detected in regression could partly reflect measurement-source switching rather than genuine economic change. Consequently, researchers must avoid overclaiming from the narrow mineral variable alone. A robustness check using the WITS Ores and Metals series consistently for the full 2000–2023 period (Section 6.6) is therefore essential, not optional, for validating the findings.</w:t>
       </w:r>
     </w:p>
-    <w:bookmarkEnd w:id="281"/>
-    <w:bookmarkStart w:id="282" w:name="b-data-validation-via-web-scraping"/>
+    <w:bookmarkEnd w:id="29"/>
+    <w:bookmarkStart w:id="30" w:name="X20eee201563074230f2421358305feb4d2b8694"/>
     <w:p>
       <w:pPr>
         <w:pStyle w:val="Heading2"/>
       </w:pPr>
       <w:r>
-        <w:t xml:space="preserve">4.3b Data Validation via Web Scraping</w:t>
+        <w:t xml:space="preserve">4.4 Data Validation via Independent Cross-Checking</w:t>
       </w:r>
     </w:p>
     <w:p>
@@ -4357,14 +4357,14 @@
         <w:t xml:space="preserve">All discrepancies are below 0.5% — well within the &lt; 10% threshold for validation support. This confirms that the trade values used in the analytical panel are consistent with Kazakhstan’s national statistical authority’s official figures. The 2023 import figure (USD 16.772 billion in the panel vs. USD 16.758 billion scraped, a difference of USD 14 million on a USD 16.8 billion total) is the most important validation given that 2023 is the most influential observation in the regression analysis.</w:t>
       </w:r>
     </w:p>
-    <w:bookmarkEnd w:id="282"/>
-    <w:bookmarkStart w:id="292" w:name="X05c1fb1c8c602400de8894489ddedb36501cd2f"/>
+    <w:bookmarkEnd w:id="30"/>
+    <w:bookmarkStart w:id="40" w:name="X05c1fb1c8c602400de8894489ddedb36501cd2f"/>
     <w:p>
       <w:pPr>
         <w:pStyle w:val="Heading2"/>
       </w:pPr>
       <w:r>
-        <w:t xml:space="preserve">4.4 Descriptive Statistics and Trade Balance Decomposition</w:t>
+        <w:t xml:space="preserve">4.5 Descriptive Statistics and Trade Balance Decomposition</w:t>
       </w:r>
     </w:p>
     <w:p>
@@ -4785,20 +4785,20 @@
       <w:r>
         <w:drawing>
           <wp:inline>
-            <wp:extent cx="5727700" cy="3173752"/>
+            <wp:extent cx="5334000" cy="2955600"/>
             <wp:effectExtent b="0" l="0" r="0" t="0"/>
-            <wp:docPr descr="Figure 1. Kazakhstan Exports to China vs Imports from China (2000–2023)" title="" id="284" name="Picture"/>
+            <wp:docPr descr="Figure 1. Kazakhstan Exports to China vs Imports from China (2000–2023)" title="" id="32" name="Picture"/>
             <a:graphic>
               <a:graphicData uri="http://schemas.openxmlformats.org/drawingml/2006/picture">
                 <pic:pic>
                   <pic:nvPicPr>
-                    <pic:cNvPr descr="../Outputs/generated_figures/fig_1_exports_imports.png" id="285" name="Picture"/>
+                    <pic:cNvPr descr="../Outputs/generated_figures/fig_1_exports_imports.png" id="33" name="Picture"/>
                     <pic:cNvPicPr>
                       <a:picLocks noChangeArrowheads="1" noChangeAspect="1"/>
                     </pic:cNvPicPr>
                   </pic:nvPicPr>
                   <pic:blipFill>
-                    <a:blip r:embed="rId283"/>
+                    <a:blip r:embed="rId31"/>
                     <a:stretch>
                       <a:fillRect/>
                     </a:stretch>
@@ -4806,7 +4806,7 @@
                   <pic:spPr bwMode="auto">
                     <a:xfrm>
                       <a:off x="0" y="0"/>
-                      <a:ext cx="5727700" cy="3173752"/>
+                      <a:ext cx="5334000" cy="2955600"/>
                     </a:xfrm>
                     <a:prstGeom prst="rect">
                       <a:avLst/>
@@ -4842,20 +4842,20 @@
       <w:r>
         <w:drawing>
           <wp:inline>
-            <wp:extent cx="5727700" cy="3215707"/>
+            <wp:extent cx="5334000" cy="2994671"/>
             <wp:effectExtent b="0" l="0" r="0" t="0"/>
-            <wp:docPr descr="Figure 2. Kazakhstan–China Bilateral Trade Balance (2000–2023)" title="" id="287" name="Picture"/>
+            <wp:docPr descr="Figure 2. Kazakhstan–China Bilateral Trade Balance (2000–2023)" title="" id="35" name="Picture"/>
             <a:graphic>
               <a:graphicData uri="http://schemas.openxmlformats.org/drawingml/2006/picture">
                 <pic:pic>
                   <pic:nvPicPr>
-                    <pic:cNvPr descr="../Outputs/generated_figures/fig_2_trade_balance.png" id="288" name="Picture"/>
+                    <pic:cNvPr descr="../Outputs/generated_figures/fig_2_trade_balance.png" id="36" name="Picture"/>
                     <pic:cNvPicPr>
                       <a:picLocks noChangeArrowheads="1" noChangeAspect="1"/>
                     </pic:cNvPicPr>
                   </pic:nvPicPr>
                   <pic:blipFill>
-                    <a:blip r:embed="rId286"/>
+                    <a:blip r:embed="rId34"/>
                     <a:stretch>
                       <a:fillRect/>
                     </a:stretch>
@@ -4863,7 +4863,7 @@
                   <pic:spPr bwMode="auto">
                     <a:xfrm>
                       <a:off x="0" y="0"/>
-                      <a:ext cx="5727700" cy="3215707"/>
+                      <a:ext cx="5334000" cy="2994671"/>
                     </a:xfrm>
                     <a:prstGeom prst="rect">
                       <a:avLst/>
@@ -4899,20 +4899,20 @@
       <w:r>
         <w:drawing>
           <wp:inline>
-            <wp:extent cx="5727700" cy="3268450"/>
+            <wp:extent cx="5334000" cy="3043790"/>
             <wp:effectExtent b="0" l="0" r="0" t="0"/>
-            <wp:docPr descr="Figure 3. Strategic Mineral Exports to China (2000–2023)" title="" id="290" name="Picture"/>
+            <wp:docPr descr="Figure 3. Strategic Mineral Exports to China (2000–2023)" title="" id="38" name="Picture"/>
             <a:graphic>
               <a:graphicData uri="http://schemas.openxmlformats.org/drawingml/2006/picture">
                 <pic:pic>
                   <pic:nvPicPr>
-                    <pic:cNvPr descr="../Outputs/generated_figures/fig_3_minerals.png" id="291" name="Picture"/>
+                    <pic:cNvPr descr="../Outputs/generated_figures/fig_3_minerals.png" id="39" name="Picture"/>
                     <pic:cNvPicPr>
                       <a:picLocks noChangeArrowheads="1" noChangeAspect="1"/>
                     </pic:cNvPicPr>
                   </pic:nvPicPr>
                   <pic:blipFill>
-                    <a:blip r:embed="rId289"/>
+                    <a:blip r:embed="rId37"/>
                     <a:stretch>
                       <a:fillRect/>
                     </a:stretch>
@@ -4920,7 +4920,7 @@
                   <pic:spPr bwMode="auto">
                     <a:xfrm>
                       <a:off x="0" y="0"/>
-                      <a:ext cx="5727700" cy="3268450"/>
+                      <a:ext cx="5334000" cy="3043790"/>
                     </a:xfrm>
                     <a:prstGeom prst="rect">
                       <a:avLst/>
@@ -5291,14 +5291,14 @@
         <w:t xml:space="preserve">The decomposition reveals that the trade-balance deterioration is driven by import-side deepening. Imports from China nearly doubled (+94.3%), while exports grew modestly (+24.3%). Strategic mineral exports grew by 29.2%, but this growth was insufficient to offset the import surge. The year 2023 is exceptional: it is the only year in the sample in which Kazakhstan recorded a bilateral trade deficit (−USD 2.01 billion), driven by imports of USD 16.77 billion exceeding exports of USD 14.76 billion.</w:t>
       </w:r>
     </w:p>
-    <w:bookmarkEnd w:id="292"/>
-    <w:bookmarkStart w:id="293" w:name="Xed3cfd76b734a5763902fe68e9f253af1d61968"/>
+    <w:bookmarkEnd w:id="40"/>
+    <w:bookmarkStart w:id="41" w:name="Xed3cfd76b734a5763902fe68e9f253af1d61968"/>
     <w:p>
       <w:pPr>
         <w:pStyle w:val="Heading2"/>
       </w:pPr>
       <w:r>
-        <w:t xml:space="preserve">4.5 Oil and Energy Exports: An Omitted Variable</w:t>
+        <w:t xml:space="preserve">4.6 Oil and Energy Exports: An Omitted Variable</w:t>
       </w:r>
     </w:p>
     <w:p>
@@ -5309,9 +5309,9 @@
         <w:t xml:space="preserve">Oil and energy exports (HS 2709, 2710, 2711, 2701) constitute approximately 60% of Kazakhstan’s total export revenues. These are absent from the current dataset because bilateral HS-level oil export data for Kazakhstan–China were not available for the full sample period. This is a major limitation. The mineral coefficient may partly capture broader commodity-cycle dynamics rather than the isolated contribution of strategic minerals. The direction of omitted variable bias is ambiguous: oil exports are positively correlated with both minerals and trade balance, so their exclusion may bias the mineral coefficient upward while simultaneously affecting the interaction term. Future research with HS-level energy data should treat oil exports as a separate control.</w:t>
       </w:r>
     </w:p>
-    <w:bookmarkEnd w:id="293"/>
-    <w:bookmarkEnd w:id="294"/>
-    <w:bookmarkStart w:id="299" w:name="empirical-strategy"/>
+    <w:bookmarkEnd w:id="41"/>
+    <w:bookmarkEnd w:id="42"/>
+    <w:bookmarkStart w:id="47" w:name="empirical-strategy"/>
     <w:p>
       <w:pPr>
         <w:pStyle w:val="Heading1"/>
@@ -5320,7 +5320,7 @@
         <w:t xml:space="preserve">5. Empirical Strategy</w:t>
       </w:r>
     </w:p>
-    <w:bookmarkStart w:id="295" w:name="baseline-ols-association-model"/>
+    <w:bookmarkStart w:id="43" w:name="baseline-ols-association-model"/>
     <w:p>
       <w:pPr>
         <w:pStyle w:val="Heading2"/>
@@ -6191,8 +6191,8 @@
         <w:t xml:space="preserve">only where the DiD partner-placebo estimate (§6.5), the synthetic counterfactual gap (§6.6), and the sanctions-robustness check (§6.4) all point in the same direction.</w:t>
       </w:r>
     </w:p>
-    <w:bookmarkEnd w:id="295"/>
-    <w:bookmarkStart w:id="296" w:name="X4e046d0ff3d9cc655891615677fc27b4e01d2f4"/>
+    <w:bookmarkEnd w:id="43"/>
+    <w:bookmarkStart w:id="44" w:name="X4e046d0ff3d9cc655891615677fc27b4e01d2f4"/>
     <w:p>
       <w:pPr>
         <w:pStyle w:val="Heading2"/>
@@ -6340,8 +6340,8 @@
         <w:t xml:space="preserve">The growth-rate specification is the primary model because it is the only specification that substantially meets the VIF &lt; 10 collinearity threshold (§6.3). Coefficient direction and approximate magnitude are consistent across all full-sample specifications (B and C), supporting the directional interpretation, while exact magnitudes should not be over-interpreted given residual collinearity in Scheme C.</w:t>
       </w:r>
     </w:p>
-    <w:bookmarkEnd w:id="296"/>
-    <w:bookmarkStart w:id="297" w:name="adl-dynamic-association-model"/>
+    <w:bookmarkEnd w:id="44"/>
+    <w:bookmarkStart w:id="45" w:name="adl-dynamic-association-model"/>
     <w:p>
       <w:pPr>
         <w:pStyle w:val="Heading2"/>
@@ -7006,8 +7006,8 @@
         <w:t xml:space="preserve">, the bounds test is applied to assess cointegration. If the PSS F-statistic falls below the upper bound, the results are interpreted as short-run dynamic associations rather than long-run equilibrium estimates.</w:t>
       </w:r>
     </w:p>
-    <w:bookmarkEnd w:id="297"/>
-    <w:bookmarkStart w:id="298" w:name="robustness-strategy"/>
+    <w:bookmarkEnd w:id="45"/>
+    <w:bookmarkStart w:id="46" w:name="robustness-strategy"/>
     <w:p>
       <w:pPr>
         <w:pStyle w:val="Heading2"/>
@@ -7024,9 +7024,9 @@
         <w:t xml:space="preserve">Robustness is assessed through: (i) a 288-specification grid varying mineral measures (narrow/broad), BRI variables (dummy/intensity), lag structures, and estimators; (ii) leave-one-out coefficient stability analysis; (iii) WITS-consistent mineral proxy for the full 2000–2023 period; (iv) exclusion of 2023.</w:t>
       </w:r>
     </w:p>
-    <w:bookmarkEnd w:id="298"/>
-    <w:bookmarkEnd w:id="299"/>
-    <w:bookmarkStart w:id="340" w:name="results"/>
+    <w:bookmarkEnd w:id="46"/>
+    <w:bookmarkEnd w:id="47"/>
+    <w:bookmarkStart w:id="88" w:name="results"/>
     <w:p>
       <w:pPr>
         <w:pStyle w:val="Heading1"/>
@@ -7035,7 +7035,7 @@
         <w:t xml:space="preserve">6. Results</w:t>
       </w:r>
     </w:p>
-    <w:bookmarkStart w:id="303" w:name="baseline-ols-results"/>
+    <w:bookmarkStart w:id="51" w:name="baseline-ols-results"/>
     <w:p>
       <w:pPr>
         <w:pStyle w:val="Heading2"/>
@@ -8321,20 +8321,20 @@
       <w:r>
         <w:drawing>
           <wp:inline>
-            <wp:extent cx="5727700" cy="4485806"/>
+            <wp:extent cx="5334000" cy="4177469"/>
             <wp:effectExtent b="0" l="0" r="0" t="0"/>
-            <wp:docPr descr="Figure 4. Strategic Mineral Exports vs Bilateral Trade Balance, Pre-BRI vs Post-BRI" title="" id="301" name="Picture"/>
+            <wp:docPr descr="Figure 4. Strategic Mineral Exports vs Bilateral Trade Balance, Pre-BRI vs Post-BRI" title="" id="49" name="Picture"/>
             <a:graphic>
               <a:graphicData uri="http://schemas.openxmlformats.org/drawingml/2006/picture">
                 <pic:pic>
                   <pic:nvPicPr>
-                    <pic:cNvPr descr="../Outputs/generated_figures/fig_4_scatter.png" id="302" name="Picture"/>
+                    <pic:cNvPr descr="../Outputs/generated_figures/fig_4_scatter.png" id="50" name="Picture"/>
                     <pic:cNvPicPr>
                       <a:picLocks noChangeArrowheads="1" noChangeAspect="1"/>
                     </pic:cNvPicPr>
                   </pic:nvPicPr>
                   <pic:blipFill>
-                    <a:blip r:embed="rId300"/>
+                    <a:blip r:embed="rId48"/>
                     <a:stretch>
                       <a:fillRect/>
                     </a:stretch>
@@ -8342,7 +8342,7 @@
                   <pic:spPr bwMode="auto">
                     <a:xfrm>
                       <a:off x="0" y="0"/>
-                      <a:ext cx="5727700" cy="4485806"/>
+                      <a:ext cx="5334000" cy="4177469"/>
                     </a:xfrm>
                     <a:prstGeom prst="rect">
                       <a:avLst/>
@@ -8371,8 +8371,8 @@
         <w:t xml:space="preserve">Source: Author’s construction. Figure 4 plots the relationship between mineral exports and the trade balance across the two periods, visualising the weakened association post-BRI.</w:t>
       </w:r>
     </w:p>
-    <w:bookmarkEnd w:id="303"/>
-    <w:bookmarkStart w:id="304" w:name="residual-diagnostics"/>
+    <w:bookmarkEnd w:id="51"/>
+    <w:bookmarkStart w:id="52" w:name="residual-diagnostics"/>
     <w:p>
       <w:pPr>
         <w:pStyle w:val="Heading2"/>
@@ -8576,8 +8576,8 @@
         <w:t xml:space="preserve">= 0.006), which motivates the use of HAC standard errors throughout. HAC standard errors correct for both heteroskedasticity and autocorrelation in inference, but do not address potential model misspecification. The Durbin–Watson statistic (1.80) is close to 2.0, suggesting that serial correlation is mild after conditioning on regressors.</w:t>
       </w:r>
     </w:p>
-    <w:bookmarkEnd w:id="304"/>
-    <w:bookmarkStart w:id="305" w:name="X104a27e6e71d30820852bbe2a04f72c58877c53"/>
+    <w:bookmarkEnd w:id="52"/>
+    <w:bookmarkStart w:id="53" w:name="X104a27e6e71d30820852bbe2a04f72c58877c53"/>
     <w:p>
       <w:pPr>
         <w:pStyle w:val="Heading2"/>
@@ -10357,8 +10357,8 @@
         <w:t xml:space="preserve">The POST variable retains VIF = 10.4, just above the conventional threshold of 10. This is because the post-BRI dummy is correlated with the trend component in GDP growth rates post-2013. Coefficient magnitudes in Scheme B should still be interpreted directionally rather than as precise structural parameters, but the reduced collinearity severity relative to Schemes A and C substantially improves inference reliability.</w:t>
       </w:r>
     </w:p>
-    <w:bookmarkEnd w:id="305"/>
-    <w:bookmarkStart w:id="306" w:name="Xbc1dfb7dc1890ac5bda4e89de7eb28a12192bb5"/>
+    <w:bookmarkEnd w:id="53"/>
+    <w:bookmarkStart w:id="54" w:name="Xbc1dfb7dc1890ac5bda4e89de7eb28a12192bb5"/>
     <w:p>
       <w:pPr>
         <w:pStyle w:val="Heading2"/>
@@ -11425,8 +11425,8 @@
         <w:t xml:space="preserve">The negative interaction is not a stable structural finding. Rather, 2023 represents a potential inflection point—the first year of bilateral deficit—that dramatically amplifies the estimated post-BRI deterioration. The thesis interprets the evidence as diagnostic: the data are consistent with an increasingly adverse trade-balance pattern, but the statistical evidence for a systematic post-BRI interaction effect depends on whether 2023 represents the beginning of a new structural pattern or a one-time shock.</w:t>
       </w:r>
     </w:p>
-    <w:bookmarkEnd w:id="306"/>
-    <w:bookmarkStart w:id="310" w:name="leave-one-out-coefficient-stability"/>
+    <w:bookmarkEnd w:id="54"/>
+    <w:bookmarkStart w:id="58" w:name="leave-one-out-coefficient-stability"/>
     <w:p>
       <w:pPr>
         <w:pStyle w:val="Heading2"/>
@@ -11442,20 +11442,20 @@
       <w:r>
         <w:drawing>
           <wp:inline>
-            <wp:extent cx="5727700" cy="4413041"/>
+            <wp:extent cx="5334000" cy="4109705"/>
             <wp:effectExtent b="0" l="0" r="0" t="0"/>
-            <wp:docPr descr="Figure 5. Influence and Leave-One-Out Diagnostics" title="" id="308" name="Picture"/>
+            <wp:docPr descr="Figure 5. Influence and Leave-One-Out Diagnostics" title="" id="56" name="Picture"/>
             <a:graphic>
               <a:graphicData uri="http://schemas.openxmlformats.org/drawingml/2006/picture">
                 <pic:pic>
                   <pic:nvPicPr>
-                    <pic:cNvPr descr="../Outputs/generated_figures/fig_5_diagnostics.png" id="309" name="Picture"/>
+                    <pic:cNvPr descr="../Outputs/generated_figures/fig_5_diagnostics.png" id="57" name="Picture"/>
                     <pic:cNvPicPr>
                       <a:picLocks noChangeArrowheads="1" noChangeAspect="1"/>
                     </pic:cNvPicPr>
                   </pic:nvPicPr>
                   <pic:blipFill>
-                    <a:blip r:embed="rId307"/>
+                    <a:blip r:embed="rId55"/>
                     <a:stretch>
                       <a:fillRect/>
                     </a:stretch>
@@ -11463,7 +11463,7 @@
                   <pic:spPr bwMode="auto">
                     <a:xfrm>
                       <a:off x="0" y="0"/>
-                      <a:ext cx="5727700" cy="4413041"/>
+                      <a:ext cx="5334000" cy="4109705"/>
                     </a:xfrm>
                     <a:prstGeom prst="rect">
                       <a:avLst/>
@@ -11500,8 +11500,8 @@
         <w:t xml:space="preserve">Figure 5 plots the influence diagnostics, including the interaction coefficient from 24 leave-one-out regressions in panel (d). Excluding any year other than 2023 produces interaction coefficients between −2.64 and −3.88, all statistically significant at the 5% level. Excluding 2023 alone reduces the coefficient to −0.41 and renders it insignificant. This confirms that the full-sample result is robust to all observations except 2023.</w:t>
       </w:r>
     </w:p>
-    <w:bookmarkEnd w:id="310"/>
-    <w:bookmarkStart w:id="311" w:name="wits-consistent-proxy-robustness"/>
+    <w:bookmarkEnd w:id="58"/>
+    <w:bookmarkStart w:id="59" w:name="wits-consistent-proxy-robustness"/>
     <w:p>
       <w:pPr>
         <w:pStyle w:val="Heading2"/>
@@ -11544,8 +11544,8 @@
         <w:t xml:space="preserve">= 0.083) excluding 2023—marginally significant. This suggests that measurement consistency partially mitigates the 2023 sensitivity, though the interaction remains fragile.</w:t>
       </w:r>
     </w:p>
-    <w:bookmarkEnd w:id="311"/>
-    <w:bookmarkStart w:id="318" w:name="adl-dynamic-association-results"/>
+    <w:bookmarkEnd w:id="59"/>
+    <w:bookmarkStart w:id="66" w:name="adl-dynamic-association-results"/>
     <w:p>
       <w:pPr>
         <w:pStyle w:val="Heading2"/>
@@ -11622,20 +11622,20 @@
       <w:r>
         <w:drawing>
           <wp:inline>
-            <wp:extent cx="5727700" cy="1909233"/>
+            <wp:extent cx="5334000" cy="1778000"/>
             <wp:effectExtent b="0" l="0" r="0" t="0"/>
-            <wp:docPr descr="Figure 6a. CUSUM Test — Model A (Post-BRI Dummy)" title="" id="313" name="Picture"/>
+            <wp:docPr descr="Figure 6a. CUSUM Test — Model A (Post-BRI Dummy)" title="" id="61" name="Picture"/>
             <a:graphic>
               <a:graphicData uri="http://schemas.openxmlformats.org/drawingml/2006/picture">
                 <pic:pic>
                   <pic:nvPicPr>
-                    <pic:cNvPr descr="../Outputs/generated_figures/fig06_cusum_Model_A_dummy.png" id="314" name="Picture"/>
+                    <pic:cNvPr descr="../Outputs/generated_figures/fig06_cusum_Model_A_dummy.png" id="62" name="Picture"/>
                     <pic:cNvPicPr>
                       <a:picLocks noChangeArrowheads="1" noChangeAspect="1"/>
                     </pic:cNvPicPr>
                   </pic:nvPicPr>
                   <pic:blipFill>
-                    <a:blip r:embed="rId312"/>
+                    <a:blip r:embed="rId60"/>
                     <a:stretch>
                       <a:fillRect/>
                     </a:stretch>
@@ -11643,7 +11643,7 @@
                   <pic:spPr bwMode="auto">
                     <a:xfrm>
                       <a:off x="0" y="0"/>
-                      <a:ext cx="5727700" cy="1909233"/>
+                      <a:ext cx="5334000" cy="1778000"/>
                     </a:xfrm>
                     <a:prstGeom prst="rect">
                       <a:avLst/>
@@ -11679,20 +11679,20 @@
       <w:r>
         <w:drawing>
           <wp:inline>
-            <wp:extent cx="5727700" cy="1909233"/>
+            <wp:extent cx="5334000" cy="1778000"/>
             <wp:effectExtent b="0" l="0" r="0" t="0"/>
-            <wp:docPr descr="Figure 6b. CUSUMSQ Test — Model A (Post-BRI Dummy)" title="" id="316" name="Picture"/>
+            <wp:docPr descr="Figure 6b. CUSUMSQ Test — Model A (Post-BRI Dummy)" title="" id="64" name="Picture"/>
             <a:graphic>
               <a:graphicData uri="http://schemas.openxmlformats.org/drawingml/2006/picture">
                 <pic:pic>
                   <pic:nvPicPr>
-                    <pic:cNvPr descr="../Outputs/generated_figures/fig07_cusum_Model_B_intensity.png" id="317" name="Picture"/>
+                    <pic:cNvPr descr="../Outputs/generated_figures/fig07_cusum_Model_B_intensity.png" id="65" name="Picture"/>
                     <pic:cNvPicPr>
                       <a:picLocks noChangeArrowheads="1" noChangeAspect="1"/>
                     </pic:cNvPicPr>
                   </pic:nvPicPr>
                   <pic:blipFill>
-                    <a:blip r:embed="rId315"/>
+                    <a:blip r:embed="rId63"/>
                     <a:stretch>
                       <a:fillRect/>
                     </a:stretch>
@@ -11700,7 +11700,7 @@
                   <pic:spPr bwMode="auto">
                     <a:xfrm>
                       <a:off x="0" y="0"/>
-                      <a:ext cx="5727700" cy="1909233"/>
+                      <a:ext cx="5334000" cy="1778000"/>
                     </a:xfrm>
                     <a:prstGeom prst="rect">
                       <a:avLst/>
@@ -11737,8 +11737,8 @@
         <w:t xml:space="preserve">Model B (BRI intensity) yields numerically unstable long-run multipliers (magnitudes exceeding 1,000), indicating near-singular estimation. This specification is unreliable and is not used for substantive interpretation.</w:t>
       </w:r>
     </w:p>
-    <w:bookmarkEnd w:id="318"/>
-    <w:bookmarkStart w:id="322" w:name="robustness-grid-summary"/>
+    <w:bookmarkEnd w:id="66"/>
+    <w:bookmarkStart w:id="70" w:name="robustness-grid-summary"/>
     <w:p>
       <w:pPr>
         <w:pStyle w:val="Heading2"/>
@@ -11994,20 +11994,20 @@
       <w:r>
         <w:drawing>
           <wp:inline>
-            <wp:extent cx="5727700" cy="3431639"/>
+            <wp:extent cx="5334000" cy="3195761"/>
             <wp:effectExtent b="0" l="0" r="0" t="0"/>
-            <wp:docPr descr="Figure 6. Model Comparison and Robustness" title="" id="320" name="Picture"/>
+            <wp:docPr descr="Figure 6. Model Comparison and Robustness" title="" id="68" name="Picture"/>
             <a:graphic>
               <a:graphicData uri="http://schemas.openxmlformats.org/drawingml/2006/picture">
                 <pic:pic>
                   <pic:nvPicPr>
-                    <pic:cNvPr descr="../Outputs/generated_figures/fig_6_pre_post.png" id="321" name="Picture"/>
+                    <pic:cNvPr descr="../Outputs/generated_figures/fig_6_pre_post.png" id="69" name="Picture"/>
                     <pic:cNvPicPr>
                       <a:picLocks noChangeArrowheads="1" noChangeAspect="1"/>
                     </pic:cNvPicPr>
                   </pic:nvPicPr>
                   <pic:blipFill>
-                    <a:blip r:embed="rId319"/>
+                    <a:blip r:embed="rId67"/>
                     <a:stretch>
                       <a:fillRect/>
                     </a:stretch>
@@ -12015,7 +12015,7 @@
                   <pic:spPr bwMode="auto">
                     <a:xfrm>
                       <a:off x="0" y="0"/>
-                      <a:ext cx="5727700" cy="3431639"/>
+                      <a:ext cx="5334000" cy="3195761"/>
                     </a:xfrm>
                     <a:prstGeom prst="rect">
                       <a:avLst/>
@@ -12052,8 +12052,8 @@
         <w:t xml:space="preserve">While 82.6% of the converged specifications yielded a negative and significant interaction, this consistency reflects the fact that most specifications include the 2023 observation. The grid confirms that the full-sample negative association is computationally robust across model types, but as demonstrated in Section 6.4, it remains fundamentally fragile to the exclusion of a single year.</w:t>
       </w:r>
     </w:p>
-    <w:bookmarkEnd w:id="322"/>
-    <w:bookmarkStart w:id="323" w:name="X02d2069ce5f5d6c121cab1de71057756545adc1"/>
+    <w:bookmarkEnd w:id="70"/>
+    <w:bookmarkStart w:id="71" w:name="X02d2069ce5f5d6c121cab1de71057756545adc1"/>
     <w:p>
       <w:pPr>
         <w:pStyle w:val="Heading2"/>
@@ -12154,8 +12154,8 @@
         <w:t xml:space="preserve">= 24 with 6 parameters offers limited degrees of freedom. The most defensible interpretation is qualitative: the trade-balance payoff of mineral exports appears to have weakened in the post-BRI period, driven primarily by the extreme 2023 outcome.</w:t>
       </w:r>
     </w:p>
-    <w:bookmarkEnd w:id="323"/>
-    <w:bookmarkStart w:id="326" w:name="Xedb9b08c4672051231fad683c8263bcd7143a2a"/>
+    <w:bookmarkEnd w:id="71"/>
+    <w:bookmarkStart w:id="74" w:name="Xedb9b08c4672051231fad683c8263bcd7143a2a"/>
     <w:p>
       <w:pPr>
         <w:pStyle w:val="Heading2"/>
@@ -12172,7 +12172,7 @@
         <w:t xml:space="preserve">The model does not achieve causal identification. Endogeneity concerns warrant explicit acknowledgement:</w:t>
       </w:r>
     </w:p>
-    <w:bookmarkStart w:id="324" w:name="Xfaa6a9c61f25d443ecdf66c7dab5526d2ab8555"/>
+    <w:bookmarkStart w:id="72" w:name="Xfaa6a9c61f25d443ecdf66c7dab5526d2ab8555"/>
     <w:p>
       <w:pPr>
         <w:pStyle w:val="Heading3"/>
@@ -12215,8 +12215,8 @@
         <w:t xml:space="preserve">While the model includes the Brent crude price as a control, Brent only captures global oil-price movements, not the specific volume of Kazakhstan’s bilateral oil exports to China. Therefore, it only partially mitigates the omitted-variable bias. The mineral coefficient and its interaction term likely absorb broader commodity-export dynamics, including the energy trade. Because the direction and magnitude of omitted oil-export bias cannot be quantified with the current data, the strategic-mineral interpretation is treated as suggestive and bounded by this limitation. This is why the thesis interprets the coefficient as diagnostic evidence of broader trade-balance fragility rather than mineral-specific causal evidence.</w:t>
       </w:r>
     </w:p>
-    <w:bookmarkEnd w:id="324"/>
-    <w:bookmarkStart w:id="325" w:name="other-endogeneity-concerns"/>
+    <w:bookmarkEnd w:id="72"/>
+    <w:bookmarkStart w:id="73" w:name="other-endogeneity-concerns"/>
     <w:p>
       <w:pPr>
         <w:pStyle w:val="Heading3"/>
@@ -12296,9 +12296,9 @@
         <w:t xml:space="preserve">The robustness strategy—comparing parsimonious and full specifications, testing multiple mineral proxies, and reporting leave-one-out sensitivity—partially addresses these concerns by showing which results are robust to specification changes. However, credible causal identification would require instrumental-variable strategies, quasi-experimental variation, or substantially larger samples.</w:t>
       </w:r>
     </w:p>
-    <w:bookmarkEnd w:id="325"/>
-    <w:bookmarkEnd w:id="326"/>
-    <w:bookmarkStart w:id="327" w:name="hypothesis-evaluation"/>
+    <w:bookmarkEnd w:id="73"/>
+    <w:bookmarkEnd w:id="74"/>
+    <w:bookmarkStart w:id="75" w:name="hypothesis-evaluation"/>
     <w:p>
       <w:pPr>
         <w:pStyle w:val="Heading2"/>
@@ -12578,8 +12578,8 @@
         </w:tc>
       </w:tr>
     </w:tbl>
-    <w:bookmarkEnd w:id="327"/>
-    <w:bookmarkStart w:id="328" w:name="Xc9abbbac6f033c0594f26051954fdebeefafa0a"/>
+    <w:bookmarkEnd w:id="75"/>
+    <w:bookmarkStart w:id="76" w:name="Xc9abbbac6f033c0594f26051954fdebeefafa0a"/>
     <w:p>
       <w:pPr>
         <w:pStyle w:val="Heading2"/>
@@ -13038,8 +13038,8 @@
         <w:t xml:space="preserve">While the interaction term retains its sign and significance under this illustrative proxy control, the lack of real bilateral HS-27 series remains an empirical limitation. Therefore, these results are treated as purely exploratory sensitivity tests rather than main empirical evidence.</w:t>
       </w:r>
     </w:p>
-    <w:bookmarkEnd w:id="328"/>
-    <w:bookmarkStart w:id="329" w:name="placebo-break-year-diagnostics"/>
+    <w:bookmarkEnd w:id="76"/>
+    <w:bookmarkStart w:id="77" w:name="placebo-break-year-diagnostics"/>
     <w:p>
       <w:pPr>
         <w:pStyle w:val="Heading2"/>
@@ -13486,8 +13486,8 @@
         <w:t xml:space="preserve">confounders (2016, 2018) than for separating early-period co-incident shocks. These limitations are fully consistent with the thesis’s broader claim that the evidence is diagnostic rather than causal.</w:t>
       </w:r>
     </w:p>
-    <w:bookmarkEnd w:id="329"/>
-    <w:bookmarkStart w:id="334" w:name="the-20222023-sanctions-evasion-channel"/>
+    <w:bookmarkEnd w:id="77"/>
+    <w:bookmarkStart w:id="82" w:name="the-20222023-sanctions-evasion-channel"/>
     <w:p>
       <w:pPr>
         <w:pStyle w:val="Heading2"/>
@@ -13496,7 +13496,7 @@
         <w:t xml:space="preserve">6.14 The 2022–2023 Sanctions-Evasion Channel</w:t>
       </w:r>
     </w:p>
-    <w:bookmarkStart w:id="330" w:name="background-and-hypothesis"/>
+    <w:bookmarkStart w:id="78" w:name="background-and-hypothesis"/>
     <w:p>
       <w:pPr>
         <w:pStyle w:val="Heading3"/>
@@ -13534,8 +13534,8 @@
         <w:t xml:space="preserve">If this hypothesis is correct, the 2023 bilateral trade deficit (−USD 2.01 billion) does not indicate a BRI-driven structural deepening of asymmetric interdependence. Instead, it reflects a temporary geopolitical shock that inflated Kazakhstan’s recorded imports from China. This would significantly weaken the causal interpretation of the post-BRI mineral interaction coefficient.</w:t>
       </w:r>
     </w:p>
-    <w:bookmarkEnd w:id="330"/>
-    <w:bookmarkStart w:id="331" w:name="import-surge-magnitude"/>
+    <w:bookmarkEnd w:id="78"/>
+    <w:bookmarkStart w:id="79" w:name="import-surge-magnitude"/>
     <w:p>
       <w:pPr>
         <w:pStyle w:val="Heading3"/>
@@ -13586,8 +13586,8 @@
         <w:t xml:space="preserve">in the local data. This remains a data limitation: a direct test of whether these categories exploded disproportionately in 2022–2023 is not possible from the current data. Closing this gap would require a dedicated Comtrade data pull for Kazakhstan as reporter, China as partner, HS chapters 84/85/87, import flow.</w:t>
       </w:r>
     </w:p>
-    <w:bookmarkEnd w:id="331"/>
-    <w:bookmarkStart w:id="332" w:name="X72f40ba1df561b40a8b38f42c7043abb0541aee"/>
+    <w:bookmarkEnd w:id="79"/>
+    <w:bookmarkStart w:id="80" w:name="X72f40ba1df561b40a8b38f42c7043abb0541aee"/>
     <w:p>
       <w:pPr>
         <w:pStyle w:val="Heading3"/>
@@ -14143,8 +14143,8 @@
         <w:t xml:space="preserve">Note: Author’s calculations. HAC (Newey–West) standard errors, bandwidth = 3.</w:t>
       </w:r>
     </w:p>
-    <w:bookmarkEnd w:id="332"/>
-    <w:bookmarkStart w:id="333" w:name="findings-and-interpretation"/>
+    <w:bookmarkEnd w:id="80"/>
+    <w:bookmarkStart w:id="81" w:name="findings-and-interpretation"/>
     <w:p>
       <w:pPr>
         <w:pStyle w:val="Heading3"/>
@@ -14360,9 +14360,9 @@
         <w:t xml:space="preserve">asymmetric interdependence rather than as causal evidence.</w:t>
       </w:r>
     </w:p>
-    <w:bookmarkEnd w:id="333"/>
-    <w:bookmarkEnd w:id="334"/>
-    <w:bookmarkStart w:id="335" w:name="X2fd92483128a5add758ee2b2eb0099452b15daa"/>
+    <w:bookmarkEnd w:id="81"/>
+    <w:bookmarkEnd w:id="82"/>
+    <w:bookmarkStart w:id="83" w:name="X2fd92483128a5add758ee2b2eb0099452b15daa"/>
     <w:p>
       <w:pPr>
         <w:pStyle w:val="Heading2"/>
@@ -15223,8 +15223,8 @@
         <w:t xml:space="preserve">The 2009/2010 marginal placebo significance in the ITS is a within-unit artefact that reflects the pre-existing downward trend in the Kazakhstan–China balance. The TWFE DiD absorbs this trend via year fixed effects and confirms the 2013 break is genuinely China-specific.</w:t>
       </w:r>
     </w:p>
-    <w:bookmarkEnd w:id="335"/>
-    <w:bookmarkStart w:id="339" w:name="synthetic-counterfactual"/>
+    <w:bookmarkEnd w:id="83"/>
+    <w:bookmarkStart w:id="87" w:name="synthetic-counterfactual"/>
     <w:p>
       <w:pPr>
         <w:pStyle w:val="Heading2"/>
@@ -15923,20 +15923,20 @@
       <w:r>
         <w:drawing>
           <wp:inline>
-            <wp:extent cx="5727700" cy="4165600"/>
+            <wp:extent cx="5334000" cy="3879272"/>
             <wp:effectExtent b="0" l="0" r="0" t="0"/>
-            <wp:docPr descr="Figure 7. Synthetic Counterfactual: Actual vs. Synthetic KZ-China Trade Balance Ratio" title="" id="337" name="Picture"/>
+            <wp:docPr descr="Figure 7. Synthetic Counterfactual: Actual vs. Synthetic KZ-China Trade Balance Ratio" title="" id="85" name="Picture"/>
             <a:graphic>
               <a:graphicData uri="http://schemas.openxmlformats.org/drawingml/2006/picture">
                 <pic:pic>
                   <pic:nvPicPr>
-                    <pic:cNvPr descr="../Outputs/generated_figures/fig_synthetic_control.png" id="338" name="Picture"/>
+                    <pic:cNvPr descr="../Outputs/generated_figures/fig_synthetic_control.png" id="86" name="Picture"/>
                     <pic:cNvPicPr>
                       <a:picLocks noChangeArrowheads="1" noChangeAspect="1"/>
                     </pic:cNvPicPr>
                   </pic:nvPicPr>
                   <pic:blipFill>
-                    <a:blip r:embed="rId336"/>
+                    <a:blip r:embed="rId84"/>
                     <a:stretch>
                       <a:fillRect/>
                     </a:stretch>
@@ -15944,7 +15944,7 @@
                   <pic:spPr bwMode="auto">
                     <a:xfrm>
                       <a:off x="0" y="0"/>
-                      <a:ext cx="5727700" cy="4165600"/>
+                      <a:ext cx="5334000" cy="3879272"/>
                     </a:xfrm>
                     <a:prstGeom prst="rect">
                       <a:avLst/>
@@ -16396,9 +16396,9 @@
         <w:t xml:space="preserve">(versus concurrent geopolitical shocks in 2022–2023) cannot be conclusively established. Causal language remains reserved for the DiD finding only; the regression interaction is described as a conditional association.</w:t>
       </w:r>
     </w:p>
-    <w:bookmarkEnd w:id="339"/>
-    <w:bookmarkEnd w:id="340"/>
-    <w:bookmarkStart w:id="345" w:name="discussion"/>
+    <w:bookmarkEnd w:id="87"/>
+    <w:bookmarkEnd w:id="88"/>
+    <w:bookmarkStart w:id="93" w:name="discussion"/>
     <w:p>
       <w:pPr>
         <w:pStyle w:val="Heading1"/>
@@ -16407,7 +16407,7 @@
         <w:t xml:space="preserve">7. Discussion</w:t>
       </w:r>
     </w:p>
-    <w:bookmarkStart w:id="341" w:name="what-the-results-show"/>
+    <w:bookmarkStart w:id="89" w:name="what-the-results-show"/>
     <w:p>
       <w:pPr>
         <w:pStyle w:val="Heading2"/>
@@ -16482,8 +16482,8 @@
         <w:t xml:space="preserve">asymmetric interdependence deepening post-BRI.</w:t>
       </w:r>
     </w:p>
-    <w:bookmarkEnd w:id="341"/>
-    <w:bookmarkStart w:id="342" w:name="what-the-results-do-not-show"/>
+    <w:bookmarkEnd w:id="89"/>
+    <w:bookmarkStart w:id="90" w:name="what-the-results-do-not-show"/>
     <w:p>
       <w:pPr>
         <w:pStyle w:val="Heading2"/>
@@ -16596,8 +16596,8 @@
         <w:t xml:space="preserve">The coefficient should be read as evidence that the trade-balance association of mineral exports weakened in the post-BRI period, not as a causal multiplier. The sanctions robustness check (§6.14) cannot rule out that part or all of the post-2013 interaction is driven by the 2022–2023 Russia-sanctions routing rather than BRI-specific structural deepening.</w:t>
       </w:r>
     </w:p>
-    <w:bookmarkEnd w:id="342"/>
-    <w:bookmarkStart w:id="343" w:name="X159a95f1f75e4cb9d73376d92636dad3144bb28"/>
+    <w:bookmarkEnd w:id="90"/>
+    <w:bookmarkStart w:id="91" w:name="X159a95f1f75e4cb9d73376d92636dad3144bb28"/>
     <w:p>
       <w:pPr>
         <w:pStyle w:val="Heading2"/>
@@ -16622,8 +16622,8 @@
         <w:t xml:space="preserve">However, from an econometric standpoint, 2023 possesses extremely high leverage. Because inference in a 24-observation dataset is fragile, the results must be reported transparently with and without this year. The full-sample interaction coefficient and the excluding-2023 estimates should be treated as co-equal evidence. The core conclusion of this thesis—that the bilateral trade relationship has grown increasingly fragile and asymmetric—is supported by the descriptive decomposition and the 2023 outcome itself, but the formal claim of a stable, systematic post-BRI statistical interaction effect must not depend solely on the full-sample regression coefficient.</w:t>
       </w:r>
     </w:p>
-    <w:bookmarkEnd w:id="343"/>
-    <w:bookmarkStart w:id="344" w:name="policy-implications"/>
+    <w:bookmarkEnd w:id="91"/>
+    <w:bookmarkStart w:id="92" w:name="policy-implications"/>
     <w:p>
       <w:pPr>
         <w:pStyle w:val="Heading2"/>
@@ -16788,9 +16788,9 @@
         <w:t xml:space="preserve">requiring policy response rather than a statistical anomaly.</w:t>
       </w:r>
     </w:p>
-    <w:bookmarkEnd w:id="344"/>
-    <w:bookmarkEnd w:id="345"/>
-    <w:bookmarkStart w:id="348" w:name="conclusion"/>
+    <w:bookmarkEnd w:id="92"/>
+    <w:bookmarkEnd w:id="93"/>
+    <w:bookmarkStart w:id="96" w:name="conclusion"/>
     <w:p>
       <w:pPr>
         <w:pStyle w:val="Heading1"/>
@@ -16860,7 +16860,7 @@
         <w:t xml:space="preserve">The thesis therefore identifies a China-specific, increasingly adverse bilateral pattern that is strongly consistent with asymmetric interdependence theory. The strongest empirical contributions are: the descriptive decomposition showing import-side deepening as the primary mechanism; the TWFE DiD demonstrating China-specificity; and the transparent reporting of regression fragility and influence diagnostics.</w:t>
       </w:r>
     </w:p>
-    <w:bookmarkStart w:id="346" w:name="interpretation-discipline"/>
+    <w:bookmarkStart w:id="94" w:name="interpretation-discipline"/>
     <w:p>
       <w:pPr>
         <w:pStyle w:val="Heading2"/>
@@ -16893,8 +16893,8 @@
         <w:t xml:space="preserve">— not a common shock across trading partners — as demonstrated by the TWFE DiD partner-placebo design (§6.15). It cannot claim that BRI causally worsened Kazakhstan’s trade balance, because the regression interaction does not survive exclusion of the 2022–2023 sanctions period and an alternative explanation via parallel-import routing cannot be ruled out. The TWFE DiD finding is the most causally credible result; the regression interaction is a conditional association.</w:t>
       </w:r>
     </w:p>
-    <w:bookmarkEnd w:id="346"/>
-    <w:bookmarkStart w:id="347" w:name="limitations-and-future-research"/>
+    <w:bookmarkEnd w:id="94"/>
+    <w:bookmarkStart w:id="95" w:name="limitations-and-future-research"/>
     <w:p>
       <w:pPr>
         <w:pStyle w:val="Heading2"/>
@@ -16940,15 +16940,15 @@
         <w:t xml:space="preserve">The finding that mineral export growth did not translate into trade-balance improvement is consistent with the broader resource-dependence literature: export success in raw materials does not automatically improve external balance when the trading partner’s diversified export capacity grows faster. For Kazakhstan and comparable corridor economies, this diagnostic evidence suggests that BRI participation should be evaluated not by aggregate trade volumes but by the composition and balance of bilateral exchange.</w:t>
       </w:r>
     </w:p>
-    <w:bookmarkEnd w:id="347"/>
-    <w:bookmarkEnd w:id="348"/>
-    <w:bookmarkStart w:id="349" w:name="appendix-table-and-figure-concordance"/>
+    <w:bookmarkEnd w:id="95"/>
+    <w:bookmarkEnd w:id="96"/>
+    <w:bookmarkStart w:id="97" w:name="X8917230a2959afca4ead821100be5c041b382e2"/>
     <w:p>
       <w:pPr>
         <w:pStyle w:val="Heading1"/>
       </w:pPr>
       <w:r>
-        <w:t xml:space="preserve">9. Appendix: Table and Figure Concordance</w:t>
+        <w:t xml:space="preserve">Appendix A: Tables and Figures Concordance</w:t>
       </w:r>
     </w:p>
     <w:p>
@@ -17124,7 +17124,7 @@
               <w:pStyle w:val="Compact"/>
             </w:pPr>
             <w:r>
-              <w:t xml:space="preserve">4.4</w:t>
+              <w:t xml:space="preserve">4.5</w:t>
             </w:r>
           </w:p>
         </w:tc>
@@ -17173,7 +17173,7 @@
               <w:pStyle w:val="Compact"/>
             </w:pPr>
             <w:r>
-              <w:t xml:space="preserve">4.4</w:t>
+              <w:t xml:space="preserve">4.5</w:t>
             </w:r>
           </w:p>
         </w:tc>
@@ -17231,6 +17231,52 @@
             </w:pPr>
             <w:r>
               <w:t xml:space="preserve">Measurement break summary</w:t>
+            </w:r>
+          </w:p>
+        </w:tc>
+      </w:tr>
+      <w:tr>
+        <w:tc>
+          <w:tcPr/>
+          <w:p>
+            <w:pPr>
+              <w:pStyle w:val="Compact"/>
+            </w:pPr>
+            <w:r>
+              <w:t xml:space="preserve">Table 4.5</w:t>
+            </w:r>
+          </w:p>
+        </w:tc>
+        <w:tc>
+          <w:tcPr/>
+          <w:p>
+            <w:pPr>
+              <w:pStyle w:val="Compact"/>
+            </w:pPr>
+            <w:r>
+              <w:t xml:space="preserve">Author’s calculations, Bureau of National Statistics (stat.gov.kz)</w:t>
+            </w:r>
+          </w:p>
+        </w:tc>
+        <w:tc>
+          <w:tcPr/>
+          <w:p>
+            <w:pPr>
+              <w:pStyle w:val="Compact"/>
+            </w:pPr>
+            <w:r>
+              <w:t xml:space="preserve">4.4</w:t>
+            </w:r>
+          </w:p>
+        </w:tc>
+        <w:tc>
+          <w:tcPr/>
+          <w:p>
+            <w:pPr>
+              <w:pStyle w:val="Compact"/>
+            </w:pPr>
+            <w:r>
+              <w:t xml:space="preserve">Independent cross-validation of bilateral trade figures</w:t>
             </w:r>
           </w:p>
         </w:tc>
@@ -17996,7 +18042,7 @@
               <w:pStyle w:val="Compact"/>
             </w:pPr>
             <w:r>
-              <w:t xml:space="preserve">4.4</w:t>
+              <w:t xml:space="preserve">4.5</w:t>
             </w:r>
           </w:p>
         </w:tc>
@@ -18045,7 +18091,7 @@
               <w:pStyle w:val="Compact"/>
             </w:pPr>
             <w:r>
-              <w:t xml:space="preserve">4.4</w:t>
+              <w:t xml:space="preserve">4.5</w:t>
             </w:r>
           </w:p>
         </w:tc>
@@ -18094,7 +18140,7 @@
               <w:pStyle w:val="Compact"/>
             </w:pPr>
             <w:r>
-              <w:t xml:space="preserve">4.4</w:t>
+              <w:t xml:space="preserve">4.5</w:t>
             </w:r>
           </w:p>
         </w:tc>
@@ -18454,14 +18500,14 @@
         </w:tc>
       </w:tr>
     </w:tbl>
-    <w:bookmarkEnd w:id="349"/>
-    <w:bookmarkStart w:id="352" w:name="X2a4b41675f3f3c302420f86aae5c9ae3362ae7d"/>
+    <w:bookmarkEnd w:id="97"/>
+    <w:bookmarkStart w:id="100" w:name="appendix-b-pre-revision-specification"/>
     <w:p>
       <w:pPr>
         <w:pStyle w:val="Heading1"/>
       </w:pPr>
       <w:r>
-        <w:t xml:space="preserve">Appendix B: Pre-Revision Specification (Retained for Transparency)</w:t>
+        <w:t xml:space="preserve">Appendix B: Pre-Revision Specification</w:t>
       </w:r>
     </w:p>
     <w:p>
@@ -18476,7 +18522,7 @@
         <w:t xml:space="preserve">This appendix documents the pre-revision OLS specification that used log(KZ GDP) and log(CN GDP) as separate level regressors. It is retained for transparency, enabling direct comparison between the midterm and final specifications and illustrating how multicollinearity resolution affected the estimates.</w:t>
       </w:r>
     </w:p>
-    <w:bookmarkStart w:id="350" w:name="appendix-b.1-pre-revision-full-model-a1"/>
+    <w:bookmarkStart w:id="98" w:name="appendix-b.1-pre-revision-full-model-a1"/>
     <w:p>
       <w:pPr>
         <w:pStyle w:val="Heading2"/>
@@ -19038,8 +19084,8 @@
         <w:t xml:space="preserve">Notes: The large constant (197.6), implausible GDP coefficient magnitudes, and max VIF &gt; 100 indicate that this specification’s coefficients absorb trending collinearity rather than identifying genuine partial effects. This specification is superseded by the growth-rate model (Scheme B, primary) and gravity-ratio model (Scheme C, robustness) in the final version.</w:t>
       </w:r>
     </w:p>
-    <w:bookmarkEnd w:id="350"/>
-    <w:bookmarkStart w:id="351" w:name="Xfc43d264906fd36d64ff21af4fbc70df67b82f2"/>
+    <w:bookmarkEnd w:id="98"/>
+    <w:bookmarkStart w:id="99" w:name="Xfc43d264906fd36d64ff21af4fbc70df67b82f2"/>
     <w:p>
       <w:pPr>
         <w:pStyle w:val="Heading2"/>
@@ -19487,15 +19533,12 @@
         <w:t xml:space="preserve">Notes: This specification achieved VIF &lt; 10 by excluding GDP controls entirely. The final primary specification (Scheme B, GDP growth rates) retains GDP-related regressors in stationary form (d.log), achieving max VIF = 10.4. The Scheme C gravity-ratio specification is reported as a robustness check (max VIF = 33.4).</w:t>
       </w:r>
     </w:p>
-    <w:bookmarkEnd w:id="351"/>
-    <w:bookmarkEnd w:id="352"/>
+    <w:bookmarkEnd w:id="99"/>
+    <w:bookmarkEnd w:id="100"/>
     <w:sectPr>
-      <w:footerReference r:id="rId9" w:type="default"/>
       <w:footnotePr>
         <w:numRestart w:val="eachSect"/>
       </w:footnotePr>
-      <w:pgSz w:h="16838" w:w="11906"/>
-      <w:pgMar w:bottom="1440" w:left="1440" w:right="1440" w:top="1440"/>
     </w:sectPr>
   </w:body>
 </w:document>
@@ -19503,24 +19546,6 @@
 
 <file path=word/comments.xml><?xml version="1.0" encoding="utf-8"?>
 <w:comments xmlns:w="http://schemas.openxmlformats.org/wordprocessingml/2006/main" xmlns:m="http://schemas.openxmlformats.org/officeDocument/2006/math" xmlns:r="http://schemas.openxmlformats.org/officeDocument/2006/relationships" xmlns:o="urn:schemas-microsoft-com:office:office" xmlns:v="urn:schemas-microsoft-com:vml" xmlns:w10="urn:schemas-microsoft-com:office:word" xmlns:a="http://schemas.openxmlformats.org/drawingml/2006/main" xmlns:pic="http://schemas.openxmlformats.org/drawingml/2006/picture" xmlns:wp="http://schemas.openxmlformats.org/drawingml/2006/wordprocessingDrawing"/>
-</file>
-
-<file path=word/footer1.xml><?xml version="1.0" encoding="utf-8"?>
-<w:ftr xmlns:m="http://schemas.openxmlformats.org/officeDocument/2006/math" xmlns:mc="http://schemas.openxmlformats.org/markup-compatibility/2006" xmlns:mo="http://schemas.microsoft.com/office/mac/office/2008/main" xmlns:mv="urn:schemas-microsoft-com:mac:vml" xmlns:o="urn:schemas-microsoft-com:office:office" xmlns:r="http://schemas.openxmlformats.org/officeDocument/2006/relationships" xmlns:v="urn:schemas-microsoft-com:vml" xmlns:w10="urn:schemas-microsoft-com:office:word" xmlns:w14="http://schemas.microsoft.com/office/word/2010/wordml" xmlns:w="http://schemas.openxmlformats.org/wordprocessingml/2006/main" xmlns:wne="http://schemas.microsoft.com/office/word/2006/wordml" xmlns:wp14="http://schemas.microsoft.com/office/word/2010/wordprocessingDrawing" xmlns:wp="http://schemas.openxmlformats.org/drawingml/2006/wordprocessingDrawing" xmlns:wpc="http://schemas.microsoft.com/office/word/2010/wordprocessingCanvas" xmlns:wpg="http://schemas.microsoft.com/office/word/2010/wordprocessingGroup" xmlns:wpi="http://schemas.microsoft.com/office/word/2010/wordprocessingInk" xmlns:wps="http://schemas.microsoft.com/office/word/2010/wordprocessingShape" mc:Ignorable="w14 wp14">
-  <w:p>
-    <w:pPr>
-      <w:pStyle w:val="Footer"/>
-      <w:jc w:val="center"/>
-    </w:pPr>
-    <w:r>
-      <w:fldChar w:fldCharType="begin"/>
-      <w:instrText xml:space="preserve">PAGE</w:instrText>
-      <w:fldChar w:fldCharType="separate"/>
-      <w:t>1</w:t>
-      <w:fldChar w:fldCharType="end"/>
-    </w:r>
-  </w:p>
-</w:ftr>
 </file>
 
 <file path=word/footnotes.xml><?xml version="1.0" encoding="utf-8"?>
@@ -19958,15 +19983,6 @@
   <w:style w:default="1" w:styleId="Normal" w:type="paragraph">
     <w:name w:val="Normal"/>
     <w:qFormat/>
-    <w:pPr>
-      <w:spacing w:after="120" w:before="0" w:line="360" w:lineRule="auto"/>
-      <w:ind w:firstLine="720"/>
-      <w:jc w:val="both"/>
-    </w:pPr>
-    <w:rPr>
-      <w:rFonts w:ascii="Times New Roman" w:eastAsia="Times New Roman" w:hAnsi="Times New Roman"/>
-      <w:sz w:val="24"/>
-    </w:rPr>
   </w:style>
   <w:style w:styleId="BodyText" w:type="paragraph">
     <w:name w:val="Body Text"/>
@@ -19974,42 +19990,22 @@
     <w:link w:val="BodyTextChar"/>
     <w:qFormat/>
     <w:pPr>
-      <w:spacing w:after="120" w:before="0" w:line="360" w:lineRule="auto"/>
-      <w:ind w:firstLine="720"/>
-      <w:jc w:val="both"/>
+      <w:spacing w:after="180" w:before="180"/>
     </w:pPr>
-    <w:rPr>
-      <w:rFonts w:ascii="Times New Roman" w:eastAsia="Times New Roman" w:hAnsi="Times New Roman"/>
-      <w:sz w:val="24"/>
-    </w:rPr>
   </w:style>
   <w:style w:customStyle="1" w:styleId="FirstParagraph" w:type="paragraph">
     <w:name w:val="First Paragraph"/>
-    <w:basedOn w:val="Normal"/>
+    <w:basedOn w:val="BodyText"/>
     <w:next w:val="BodyText"/>
     <w:qFormat/>
-    <w:pPr>
-      <w:spacing w:after="120" w:before="0" w:line="360" w:lineRule="auto"/>
-      <w:jc w:val="both"/>
-    </w:pPr>
-    <w:rPr>
-      <w:rFonts w:ascii="Times New Roman" w:eastAsia="Times New Roman" w:hAnsi="Times New Roman"/>
-      <w:sz w:val="24"/>
-    </w:rPr>
   </w:style>
   <w:style w:customStyle="1" w:styleId="Compact" w:type="paragraph">
     <w:name w:val="Compact"/>
-    <w:basedOn w:val="Normal"/>
+    <w:basedOn w:val="BodyText"/>
     <w:qFormat/>
     <w:pPr>
-      <w:spacing w:after="120" w:before="0" w:line="360" w:lineRule="auto"/>
-      <w:ind w:firstLine="720"/>
-      <w:jc w:val="both"/>
+      <w:spacing w:after="36" w:before="36"/>
     </w:pPr>
-    <w:rPr>
-      <w:rFonts w:ascii="Times New Roman" w:eastAsia="Times New Roman" w:hAnsi="Times New Roman"/>
-      <w:sz w:val="24"/>
-    </w:rPr>
   </w:style>
   <w:style w:styleId="Title" w:type="paragraph">
     <w:name w:val="Title"/>
@@ -20020,14 +20016,13 @@
     <w:qFormat/>
     <w:rsid w:val="00A10FD9"/>
     <w:pPr>
-      <w:spacing w:after="200" w:before="1440" w:line="276" w:lineRule="auto"/>
+      <w:spacing w:after="80" w:line="240" w:lineRule="auto"/>
       <w:contextualSpacing/>
       <w:jc w:val="center"/>
     </w:pPr>
     <w:rPr>
-      <w:rFonts w:ascii="Times New Roman" w:asciiTheme="majorHAnsi" w:cstheme="majorBidi" w:eastAsia="Times New Roman" w:eastAsiaTheme="majorEastAsia" w:hAnsi="Times New Roman" w:hAnsiTheme="majorHAnsi"/>
-      <w:b/>
-      <w:sz w:val="32"/>
+      <w:rFonts w:asciiTheme="majorHAnsi" w:cstheme="majorBidi" w:eastAsiaTheme="majorEastAsia" w:hAnsiTheme="majorHAnsi"/>
+      <w:sz w:val="56"/>
       <w:szCs w:val="56"/>
     </w:rPr>
   </w:style>
@@ -20045,7 +20040,7 @@
   </w:style>
   <w:style w:styleId="Subtitle" w:type="paragraph">
     <w:name w:val="Subtitle"/>
-    <w:basedOn w:val="Normal"/>
+    <w:basedOn w:val="Title"/>
     <w:next w:val="BodyText"/>
     <w:link w:val="SubtitleChar"/>
     <w:uiPriority w:val="11"/>
@@ -20055,15 +20050,11 @@
       <w:numPr>
         <w:ilvl w:val="1"/>
       </w:numPr>
-      <w:spacing w:after="360" w:before="0" w:line="276" w:lineRule="auto"/>
-      <w:jc w:val="center"/>
     </w:pPr>
     <w:rPr>
-      <w:rFonts w:ascii="Times New Roman" w:cstheme="majorBidi" w:eastAsia="Times New Roman" w:eastAsiaTheme="majorEastAsia" w:hAnsi="Times New Roman"/>
-      <w:i/>
-      <w:color w:val="414141"/>
+      <w:rFonts w:cstheme="majorBidi" w:eastAsiaTheme="majorEastAsia"/>
       <w:spacing w:val="15"/>
-      <w:sz w:val="24"/>
+      <w:sz w:val="28"/>
       <w:szCs w:val="28"/>
     </w:rPr>
   </w:style>
@@ -20083,34 +20074,28 @@
   </w:style>
   <w:style w:customStyle="1" w:styleId="Author" w:type="paragraph">
     <w:name w:val="Author"/>
-    <w:basedOn w:val="Normal"/>
+    <w:basedOn w:val="Title"/>
     <w:next w:val="BodyText"/>
     <w:qFormat/>
     <w:pPr>
       <w:keepNext/>
       <w:keepLines/>
-      <w:spacing w:after="120" w:before="0" w:line="276" w:lineRule="auto"/>
-      <w:jc w:val="center"/>
     </w:pPr>
     <w:rPr>
-      <w:rFonts w:ascii="Times New Roman" w:eastAsia="Times New Roman" w:hAnsi="Times New Roman"/>
       <w:sz w:val="24"/>
       <w:szCs w:val="24"/>
     </w:rPr>
   </w:style>
   <w:style w:styleId="Date" w:type="paragraph">
     <w:name w:val="Date"/>
-    <w:basedOn w:val="Normal"/>
+    <w:basedOn w:val="Title"/>
     <w:next w:val="BodyText"/>
     <w:qFormat/>
     <w:pPr>
       <w:keepNext/>
       <w:keepLines/>
-      <w:spacing w:after="120" w:before="0" w:line="276" w:lineRule="auto"/>
-      <w:jc w:val="center"/>
     </w:pPr>
     <w:rPr>
-      <w:rFonts w:ascii="Times New Roman" w:eastAsia="Times New Roman" w:hAnsi="Times New Roman"/>
       <w:sz w:val="24"/>
       <w:szCs w:val="24"/>
     </w:rPr>
@@ -20152,15 +20137,8 @@
     <w:basedOn w:val="Normal"/>
     <w:next w:val="Bibliography"/>
     <w:qFormat/>
-    <w:pPr>
-      <w:spacing w:after="120" w:before="0" w:line="240" w:lineRule="auto"/>
-      <w:ind w:hanging="720" w:left="720"/>
-    </w:pPr>
-    <w:rPr>
-      <w:rFonts w:ascii="Times New Roman" w:eastAsia="Times New Roman" w:hAnsi="Times New Roman"/>
-      <w:b w:val="0"/>
-      <w:sz w:val="24"/>
-    </w:rPr>
+    <w:pPr/>
+    <w:rPr/>
   </w:style>
   <w:style w:styleId="Heading1" w:type="paragraph">
     <w:name w:val="heading 1"/>
@@ -20173,15 +20151,13 @@
     <w:pPr>
       <w:keepNext/>
       <w:keepLines/>
-      <w:spacing w:after="160" w:before="360" w:line="276" w:lineRule="auto"/>
-      <w:jc w:val="left"/>
+      <w:spacing w:after="80" w:before="360"/>
       <w:outlineLvl w:val="0"/>
     </w:pPr>
     <w:rPr>
-      <w:rFonts w:ascii="Times New Roman" w:asciiTheme="majorHAnsi" w:cstheme="majorBidi" w:eastAsia="Times New Roman" w:eastAsiaTheme="majorEastAsia" w:hAnsi="Times New Roman" w:hAnsiTheme="majorHAnsi"/>
-      <w:b/>
+      <w:rFonts w:asciiTheme="majorHAnsi" w:cstheme="majorBidi" w:eastAsiaTheme="majorEastAsia" w:hAnsiTheme="majorHAnsi"/>
       <w:color w:themeColor="accent1" w:themeShade="BF" w:val="0F4761"/>
-      <w:sz w:val="28"/>
+      <w:sz w:val="40"/>
       <w:szCs w:val="40"/>
     </w:rPr>
   </w:style>
@@ -20198,15 +20174,13 @@
     <w:pPr>
       <w:keepNext/>
       <w:keepLines/>
-      <w:spacing w:after="120" w:before="280" w:line="276" w:lineRule="auto"/>
-      <w:jc w:val="left"/>
+      <w:spacing w:after="80" w:before="160"/>
       <w:outlineLvl w:val="1"/>
     </w:pPr>
     <w:rPr>
-      <w:rFonts w:ascii="Times New Roman" w:asciiTheme="majorHAnsi" w:cstheme="majorBidi" w:eastAsia="Times New Roman" w:eastAsiaTheme="majorEastAsia" w:hAnsi="Times New Roman" w:hAnsiTheme="majorHAnsi"/>
-      <w:b/>
+      <w:rFonts w:asciiTheme="majorHAnsi" w:cstheme="majorBidi" w:eastAsiaTheme="majorEastAsia" w:hAnsiTheme="majorHAnsi"/>
       <w:color w:themeColor="accent1" w:themeShade="BF" w:val="0F4761"/>
-      <w:sz w:val="26"/>
+      <w:sz w:val="32"/>
       <w:szCs w:val="32"/>
     </w:rPr>
   </w:style>
@@ -20223,16 +20197,13 @@
     <w:pPr>
       <w:keepNext/>
       <w:keepLines/>
-      <w:spacing w:after="80" w:before="200" w:line="276" w:lineRule="auto"/>
-      <w:jc w:val="left"/>
+      <w:spacing w:after="80" w:before="160"/>
       <w:outlineLvl w:val="2"/>
     </w:pPr>
     <w:rPr>
-      <w:rFonts w:ascii="Times New Roman" w:cstheme="majorBidi" w:eastAsia="Times New Roman" w:eastAsiaTheme="majorEastAsia" w:hAnsi="Times New Roman"/>
-      <w:b/>
-      <w:i/>
+      <w:rFonts w:cstheme="majorBidi" w:eastAsiaTheme="majorEastAsia"/>
       <w:color w:themeColor="accent1" w:themeShade="BF" w:val="0F4761"/>
-      <w:sz w:val="24"/>
+      <w:sz w:val="28"/>
       <w:szCs w:val="28"/>
     </w:rPr>
   </w:style>
@@ -20489,20 +20460,15 @@
   </w:style>
   <w:style w:styleId="BlockText" w:type="paragraph">
     <w:name w:val="Block Text"/>
-    <w:basedOn w:val="Normal"/>
+    <w:basedOn w:val="BodyText"/>
     <w:next w:val="BodyText"/>
     <w:uiPriority w:val="9"/>
     <w:unhideWhenUsed/>
     <w:qFormat/>
     <w:pPr>
-      <w:spacing w:after="120" w:before="120" w:line="276" w:lineRule="auto"/>
-      <w:ind w:left="504" w:right="480"/>
-      <w:jc w:val="both"/>
+      <w:spacing w:after="100" w:before="100"/>
+      <w:ind w:firstLine="0" w:left="480" w:right="480"/>
     </w:pPr>
-    <w:rPr>
-      <w:rFonts w:ascii="Times New Roman" w:eastAsia="Times New Roman" w:hAnsi="Times New Roman"/>
-      <w:sz w:val="22"/>
-    </w:rPr>
   </w:style>
   <w:style w:styleId="FootnoteText" w:type="paragraph">
     <w:name w:val="Footnote Text"/>
@@ -20575,13 +20541,10 @@
     <w:basedOn w:val="Normal"/>
     <w:link w:val="BodyTextChar"/>
     <w:pPr>
-      <w:spacing w:after="200" w:before="80" w:line="240" w:lineRule="auto"/>
-      <w:jc w:val="center"/>
+      <w:spacing w:after="120" w:before="0"/>
     </w:pPr>
     <w:rPr>
-      <w:rFonts w:ascii="Times New Roman" w:eastAsia="Times New Roman" w:hAnsi="Times New Roman"/>
       <w:i/>
-      <w:sz w:val="20"/>
     </w:rPr>
   </w:style>
   <w:style w:customStyle="1" w:styleId="TableCaption" w:type="paragraph">
@@ -20589,14 +20552,7 @@
     <w:basedOn w:val="Caption"/>
     <w:pPr>
       <w:keepNext/>
-      <w:spacing w:after="80" w:before="160" w:line="240" w:lineRule="auto"/>
-      <w:jc w:val="left"/>
     </w:pPr>
-    <w:rPr>
-      <w:rFonts w:ascii="Times New Roman" w:eastAsia="Times New Roman" w:hAnsi="Times New Roman"/>
-      <w:i/>
-      <w:sz w:val="20"/>
-    </w:rPr>
   </w:style>
   <w:style w:customStyle="1" w:styleId="ImageCaption" w:type="paragraph">
     <w:name w:val="Image Caption"/>
@@ -20646,63 +20602,31 @@
   </w:style>
   <w:style w:styleId="TOCHeading" w:type="paragraph">
     <w:name w:val="TOC Heading"/>
-    <w:basedOn w:val="Normal"/>
+    <w:basedOn w:val="Heading1"/>
     <w:next w:val="BodyText"/>
     <w:uiPriority w:val="39"/>
     <w:unhideWhenUsed/>
     <w:qFormat/>
     <w:pPr>
-      <w:spacing w:after="120" w:before="240" w:line="240" w:lineRule="auto"/>
+      <w:spacing w:before="240" w:line="259" w:lineRule="auto"/>
       <w:outlineLvl w:val="9"/>
     </w:pPr>
     <w:rPr>
-      <w:rFonts w:ascii="Times New Roman" w:asciiTheme="majorHAnsi" w:cstheme="majorBidi" w:eastAsia="Times New Roman" w:eastAsiaTheme="majorEastAsia" w:hAnsi="Times New Roman" w:hAnsiTheme="majorHAnsi"/>
-      <w:b/>
+      <w:rFonts w:asciiTheme="majorHAnsi" w:cstheme="majorBidi" w:eastAsiaTheme="majorEastAsia" w:hAnsiTheme="majorHAnsi"/>
+      <w:b w:val="0"/>
       <w:bCs w:val="0"/>
       <w:color w:themeColor="accent1" w:themeShade="BF" w:val="365F91"/>
-      <w:sz w:val="24"/>
     </w:rPr>
   </w:style>
-  <w:style w:customStyle="1" w:styleId="StaticTOC1" w:type="paragraph">
-    <w:name w:val="Static TOC 1"/>
-    <w:basedOn w:val="Normal"/>
-    <w:pPr>
-      <w:spacing w:after="40" w:before="0" w:line="240" w:lineRule="auto"/>
-      <w:jc w:val="left"/>
-    </w:pPr>
-    <w:rPr>
-      <w:rFonts w:ascii="Times New Roman" w:eastAsia="Times New Roman" w:hAnsi="Times New Roman"/>
-      <w:b/>
-      <w:sz w:val="22"/>
-    </w:rPr>
-  </w:style>
-  <w:style w:customStyle="1" w:styleId="StaticTOC2" w:type="paragraph">
-    <w:name w:val="Static TOC 2"/>
-    <w:basedOn w:val="Normal"/>
-    <w:pPr>
-      <w:spacing w:after="40" w:before="0" w:line="240" w:lineRule="auto"/>
-      <w:ind w:left="317"/>
-      <w:jc w:val="left"/>
-    </w:pPr>
-    <w:rPr>
-      <w:rFonts w:ascii="Times New Roman" w:eastAsia="Times New Roman" w:hAnsi="Times New Roman"/>
-      <w:b w:val="0"/>
-      <w:sz w:val="21"/>
-    </w:rPr>
-  </w:style>
-  <w:style w:customStyle="1" w:styleId="SourceCode" w:type="paragraph">
+  <w:style w:type="paragraph" w:customStyle="1" w:styleId="SourceCode">
     <w:name w:val="Source Code"/>
     <w:basedOn w:val="Normal"/>
+    <w:link w:val="VerbatimChar"/>
     <w:pPr>
-      <w:spacing w:after="60" w:before="0" w:line="240" w:lineRule="auto"/>
-      <w:jc w:val="left"/>
+      <w:wordWrap w:val="off"/>
     </w:pPr>
-    <w:rPr>
-      <w:rFonts w:ascii="Courier New" w:eastAsia="Courier New" w:hAnsi="Courier New"/>
-      <w:sz w:val="20"/>
-    </w:rPr>
   </w:style>
-  <w:style w:customStyle="1" w:styleId="KeywordTok" w:type="character">
+  <w:style w:type="character" w:customStyle="1" w:styleId="KeywordTok">
     <w:name w:val="KeywordTok"/>
     <w:basedOn w:val="VerbatimChar"/>
     <w:rPr>
@@ -20710,77 +20634,77 @@
       <w:color w:val="007020"/>
     </w:rPr>
   </w:style>
-  <w:style w:customStyle="1" w:styleId="DataTypeTok" w:type="character">
+  <w:style w:type="character" w:customStyle="1" w:styleId="DataTypeTok">
     <w:name w:val="DataTypeTok"/>
     <w:basedOn w:val="VerbatimChar"/>
     <w:rPr>
       <w:color w:val="902000"/>
     </w:rPr>
   </w:style>
-  <w:style w:customStyle="1" w:styleId="DecValTok" w:type="character">
+  <w:style w:type="character" w:customStyle="1" w:styleId="DecValTok">
     <w:name w:val="DecValTok"/>
     <w:basedOn w:val="VerbatimChar"/>
     <w:rPr>
       <w:color w:val="40a070"/>
     </w:rPr>
   </w:style>
-  <w:style w:customStyle="1" w:styleId="BaseNTok" w:type="character">
+  <w:style w:type="character" w:customStyle="1" w:styleId="BaseNTok">
     <w:name w:val="BaseNTok"/>
     <w:basedOn w:val="VerbatimChar"/>
     <w:rPr>
       <w:color w:val="40a070"/>
     </w:rPr>
   </w:style>
-  <w:style w:customStyle="1" w:styleId="FloatTok" w:type="character">
+  <w:style w:type="character" w:customStyle="1" w:styleId="FloatTok">
     <w:name w:val="FloatTok"/>
     <w:basedOn w:val="VerbatimChar"/>
     <w:rPr>
       <w:color w:val="40a070"/>
     </w:rPr>
   </w:style>
-  <w:style w:customStyle="1" w:styleId="ConstantTok" w:type="character">
+  <w:style w:type="character" w:customStyle="1" w:styleId="ConstantTok">
     <w:name w:val="ConstantTok"/>
     <w:basedOn w:val="VerbatimChar"/>
     <w:rPr>
       <w:color w:val="880000"/>
     </w:rPr>
   </w:style>
-  <w:style w:customStyle="1" w:styleId="CharTok" w:type="character">
+  <w:style w:type="character" w:customStyle="1" w:styleId="CharTok">
     <w:name w:val="CharTok"/>
     <w:basedOn w:val="VerbatimChar"/>
     <w:rPr>
       <w:color w:val="4070a0"/>
     </w:rPr>
   </w:style>
-  <w:style w:customStyle="1" w:styleId="SpecialCharTok" w:type="character">
+  <w:style w:type="character" w:customStyle="1" w:styleId="SpecialCharTok">
     <w:name w:val="SpecialCharTok"/>
     <w:basedOn w:val="VerbatimChar"/>
     <w:rPr>
       <w:color w:val="4070a0"/>
     </w:rPr>
   </w:style>
-  <w:style w:customStyle="1" w:styleId="StringTok" w:type="character">
+  <w:style w:type="character" w:customStyle="1" w:styleId="StringTok">
     <w:name w:val="StringTok"/>
     <w:basedOn w:val="VerbatimChar"/>
     <w:rPr>
       <w:color w:val="4070a0"/>
     </w:rPr>
   </w:style>
-  <w:style w:customStyle="1" w:styleId="VerbatimStringTok" w:type="character">
+  <w:style w:type="character" w:customStyle="1" w:styleId="VerbatimStringTok">
     <w:name w:val="VerbatimStringTok"/>
     <w:basedOn w:val="VerbatimChar"/>
     <w:rPr>
       <w:color w:val="4070a0"/>
     </w:rPr>
   </w:style>
-  <w:style w:customStyle="1" w:styleId="SpecialStringTok" w:type="character">
+  <w:style w:type="character" w:customStyle="1" w:styleId="SpecialStringTok">
     <w:name w:val="SpecialStringTok"/>
     <w:basedOn w:val="VerbatimChar"/>
     <w:rPr>
       <w:color w:val="bb6688"/>
     </w:rPr>
   </w:style>
-  <w:style w:customStyle="1" w:styleId="ImportTok" w:type="character">
+  <w:style w:type="character" w:customStyle="1" w:styleId="ImportTok">
     <w:name w:val="ImportTok"/>
     <w:basedOn w:val="VerbatimChar"/>
     <w:rPr>
@@ -20788,7 +20712,7 @@
       <w:color w:val="008000"/>
     </w:rPr>
   </w:style>
-  <w:style w:customStyle="1" w:styleId="CommentTok" w:type="character">
+  <w:style w:type="character" w:customStyle="1" w:styleId="CommentTok">
     <w:name w:val="CommentTok"/>
     <w:basedOn w:val="VerbatimChar"/>
     <w:rPr>
@@ -20796,7 +20720,7 @@
       <w:color w:val="60a0b0"/>
     </w:rPr>
   </w:style>
-  <w:style w:customStyle="1" w:styleId="DocumentationTok" w:type="character">
+  <w:style w:type="character" w:customStyle="1" w:styleId="DocumentationTok">
     <w:name w:val="DocumentationTok"/>
     <w:basedOn w:val="VerbatimChar"/>
     <w:rPr>
@@ -20804,7 +20728,7 @@
       <w:color w:val="ba2121"/>
     </w:rPr>
   </w:style>
-  <w:style w:customStyle="1" w:styleId="AnnotationTok" w:type="character">
+  <w:style w:type="character" w:customStyle="1" w:styleId="AnnotationTok">
     <w:name w:val="AnnotationTok"/>
     <w:basedOn w:val="VerbatimChar"/>
     <w:rPr>
@@ -20813,7 +20737,7 @@
       <w:color w:val="60a0b0"/>
     </w:rPr>
   </w:style>
-  <w:style w:customStyle="1" w:styleId="CommentVarTok" w:type="character">
+  <w:style w:type="character" w:customStyle="1" w:styleId="CommentVarTok">
     <w:name w:val="CommentVarTok"/>
     <w:basedOn w:val="VerbatimChar"/>
     <w:rPr>
@@ -20822,28 +20746,28 @@
       <w:color w:val="60a0b0"/>
     </w:rPr>
   </w:style>
-  <w:style w:customStyle="1" w:styleId="OtherTok" w:type="character">
+  <w:style w:type="character" w:customStyle="1" w:styleId="OtherTok">
     <w:name w:val="OtherTok"/>
     <w:basedOn w:val="VerbatimChar"/>
     <w:rPr>
       <w:color w:val="007020"/>
     </w:rPr>
   </w:style>
-  <w:style w:customStyle="1" w:styleId="FunctionTok" w:type="character">
+  <w:style w:type="character" w:customStyle="1" w:styleId="FunctionTok">
     <w:name w:val="FunctionTok"/>
     <w:basedOn w:val="VerbatimChar"/>
     <w:rPr>
       <w:color w:val="06287e"/>
     </w:rPr>
   </w:style>
-  <w:style w:customStyle="1" w:styleId="VariableTok" w:type="character">
+  <w:style w:type="character" w:customStyle="1" w:styleId="VariableTok">
     <w:name w:val="VariableTok"/>
     <w:basedOn w:val="VerbatimChar"/>
     <w:rPr>
       <w:color w:val="19177c"/>
     </w:rPr>
   </w:style>
-  <w:style w:customStyle="1" w:styleId="ControlFlowTok" w:type="character">
+  <w:style w:type="character" w:customStyle="1" w:styleId="ControlFlowTok">
     <w:name w:val="ControlFlowTok"/>
     <w:basedOn w:val="VerbatimChar"/>
     <w:rPr>
@@ -20851,45 +20775,45 @@
       <w:color w:val="007020"/>
     </w:rPr>
   </w:style>
-  <w:style w:customStyle="1" w:styleId="OperatorTok" w:type="character">
+  <w:style w:type="character" w:customStyle="1" w:styleId="OperatorTok">
     <w:name w:val="OperatorTok"/>
     <w:basedOn w:val="VerbatimChar"/>
     <w:rPr>
       <w:color w:val="666666"/>
     </w:rPr>
   </w:style>
-  <w:style w:customStyle="1" w:styleId="BuiltInTok" w:type="character">
+  <w:style w:type="character" w:customStyle="1" w:styleId="BuiltInTok">
     <w:name w:val="BuiltInTok"/>
     <w:basedOn w:val="VerbatimChar"/>
     <w:rPr>
       <w:color w:val="008000"/>
     </w:rPr>
   </w:style>
-  <w:style w:customStyle="1" w:styleId="ExtensionTok" w:type="character">
+  <w:style w:type="character" w:customStyle="1" w:styleId="ExtensionTok">
     <w:name w:val="ExtensionTok"/>
     <w:basedOn w:val="VerbatimChar"/>
     <w:rPr/>
   </w:style>
-  <w:style w:customStyle="1" w:styleId="PreprocessorTok" w:type="character">
+  <w:style w:type="character" w:customStyle="1" w:styleId="PreprocessorTok">
     <w:name w:val="PreprocessorTok"/>
     <w:basedOn w:val="VerbatimChar"/>
     <w:rPr>
       <w:color w:val="bc7a00"/>
     </w:rPr>
   </w:style>
-  <w:style w:customStyle="1" w:styleId="AttributeTok" w:type="character">
+  <w:style w:type="character" w:customStyle="1" w:styleId="AttributeTok">
     <w:name w:val="AttributeTok"/>
     <w:basedOn w:val="VerbatimChar"/>
     <w:rPr>
       <w:color w:val="7d9029"/>
     </w:rPr>
   </w:style>
-  <w:style w:customStyle="1" w:styleId="RegionMarkerTok" w:type="character">
+  <w:style w:type="character" w:customStyle="1" w:styleId="RegionMarkerTok">
     <w:name w:val="RegionMarkerTok"/>
     <w:basedOn w:val="VerbatimChar"/>
     <w:rPr/>
   </w:style>
-  <w:style w:customStyle="1" w:styleId="InformationTok" w:type="character">
+  <w:style w:type="character" w:customStyle="1" w:styleId="InformationTok">
     <w:name w:val="InformationTok"/>
     <w:basedOn w:val="VerbatimChar"/>
     <w:rPr>
@@ -20898,7 +20822,7 @@
       <w:color w:val="60a0b0"/>
     </w:rPr>
   </w:style>
-  <w:style w:customStyle="1" w:styleId="WarningTok" w:type="character">
+  <w:style w:type="character" w:customStyle="1" w:styleId="WarningTok">
     <w:name w:val="WarningTok"/>
     <w:basedOn w:val="VerbatimChar"/>
     <w:rPr>
@@ -20907,7 +20831,7 @@
       <w:color w:val="60a0b0"/>
     </w:rPr>
   </w:style>
-  <w:style w:customStyle="1" w:styleId="AlertTok" w:type="character">
+  <w:style w:type="character" w:customStyle="1" w:styleId="AlertTok">
     <w:name w:val="AlertTok"/>
     <w:basedOn w:val="VerbatimChar"/>
     <w:rPr>
@@ -20915,7 +20839,7 @@
       <w:color w:val="ff0000"/>
     </w:rPr>
   </w:style>
-  <w:style w:customStyle="1" w:styleId="ErrorTok" w:type="character">
+  <w:style w:type="character" w:customStyle="1" w:styleId="ErrorTok">
     <w:name w:val="ErrorTok"/>
     <w:basedOn w:val="VerbatimChar"/>
     <w:rPr>
@@ -20923,7 +20847,7 @@
       <w:color w:val="ff0000"/>
     </w:rPr>
   </w:style>
-  <w:style w:customStyle="1" w:styleId="NormalTok" w:type="character">
+  <w:style w:type="character" w:customStyle="1" w:styleId="NormalTok">
     <w:name w:val="NormalTok"/>
     <w:basedOn w:val="VerbatimChar"/>
     <w:rPr/>

</xml_diff>

<commit_message>
fix(paper): add References heading before appendices
Added '# References' with <div id='refs'> placeholder so pandoc places
the APA bibliography between the conclusion and the appendices with a
proper section heading, not silently at the end of the document.
</commit_message>
<xml_diff>
--- a/Paper/final_dissertation.docx
+++ b/Paper/final_dissertation.docx
@@ -16942,7 +16942,19 @@
     </w:p>
     <w:bookmarkEnd w:id="95"/>
     <w:bookmarkEnd w:id="96"/>
-    <w:bookmarkStart w:id="97" w:name="X8917230a2959afca4ead821100be5c041b382e2"/>
+    <w:bookmarkStart w:id="98" w:name="references"/>
+    <w:p>
+      <w:pPr>
+        <w:pStyle w:val="Heading1"/>
+      </w:pPr>
+      <w:r>
+        <w:t xml:space="preserve">References</w:t>
+      </w:r>
+    </w:p>
+    <w:bookmarkStart w:id="97" w:name="refs"/>
+    <w:bookmarkEnd w:id="97"/>
+    <w:bookmarkEnd w:id="98"/>
+    <w:bookmarkStart w:id="99" w:name="X8917230a2959afca4ead821100be5c041b382e2"/>
     <w:p>
       <w:pPr>
         <w:pStyle w:val="Heading1"/>
@@ -18500,8 +18512,8 @@
         </w:tc>
       </w:tr>
     </w:tbl>
-    <w:bookmarkEnd w:id="97"/>
-    <w:bookmarkStart w:id="100" w:name="appendix-b-pre-revision-specification"/>
+    <w:bookmarkEnd w:id="99"/>
+    <w:bookmarkStart w:id="102" w:name="appendix-b-pre-revision-specification"/>
     <w:p>
       <w:pPr>
         <w:pStyle w:val="Heading1"/>
@@ -18522,7 +18534,7 @@
         <w:t xml:space="preserve">This appendix documents the pre-revision OLS specification that used log(KZ GDP) and log(CN GDP) as separate level regressors. It is retained for transparency, enabling direct comparison between the midterm and final specifications and illustrating how multicollinearity resolution affected the estimates.</w:t>
       </w:r>
     </w:p>
-    <w:bookmarkStart w:id="98" w:name="appendix-b.1-pre-revision-full-model-a1"/>
+    <w:bookmarkStart w:id="100" w:name="appendix-b.1-pre-revision-full-model-a1"/>
     <w:p>
       <w:pPr>
         <w:pStyle w:val="Heading2"/>
@@ -19084,8 +19096,8 @@
         <w:t xml:space="preserve">Notes: The large constant (197.6), implausible GDP coefficient magnitudes, and max VIF &gt; 100 indicate that this specification’s coefficients absorb trending collinearity rather than identifying genuine partial effects. This specification is superseded by the growth-rate model (Scheme B, primary) and gravity-ratio model (Scheme C, robustness) in the final version.</w:t>
       </w:r>
     </w:p>
-    <w:bookmarkEnd w:id="98"/>
-    <w:bookmarkStart w:id="99" w:name="Xfc43d264906fd36d64ff21af4fbc70df67b82f2"/>
+    <w:bookmarkEnd w:id="100"/>
+    <w:bookmarkStart w:id="101" w:name="Xfc43d264906fd36d64ff21af4fbc70df67b82f2"/>
     <w:p>
       <w:pPr>
         <w:pStyle w:val="Heading2"/>
@@ -19533,8 +19545,8 @@
         <w:t xml:space="preserve">Notes: This specification achieved VIF &lt; 10 by excluding GDP controls entirely. The final primary specification (Scheme B, GDP growth rates) retains GDP-related regressors in stationary form (d.log), achieving max VIF = 10.4. The Scheme C gravity-ratio specification is reported as a robustness check (max VIF = 33.4).</w:t>
       </w:r>
     </w:p>
-    <w:bookmarkEnd w:id="99"/>
-    <w:bookmarkEnd w:id="100"/>
+    <w:bookmarkEnd w:id="101"/>
+    <w:bookmarkEnd w:id="102"/>
     <w:sectPr>
       <w:footnotePr>
         <w:numRestart w:val="eachSect"/>

</xml_diff>

<commit_message>
fix(pdf): embed all figures as base64 so Chrome renders them correctly
Images used relative paths (../Outputs/...) which resolved correctly from
the Paper/ directory but broke when Chrome loaded the HTML from /tmp/.
Fixed by adding --embed-resources to pandoc so all 10 figures are baked
into the HTML as base64 data URIs before Chrome prints to PDF.

Also added missing Figure DiD (ITS + placebo event study) inline in §6.15.
</commit_message>
<xml_diff>
--- a/Paper/final_dissertation.docx
+++ b/Paper/final_dissertation.docx
@@ -7026,7 +7026,7 @@
     </w:p>
     <w:bookmarkEnd w:id="46"/>
     <w:bookmarkEnd w:id="47"/>
-    <w:bookmarkStart w:id="88" w:name="results"/>
+    <w:bookmarkStart w:id="91" w:name="results"/>
     <w:p>
       <w:pPr>
         <w:pStyle w:val="Heading1"/>
@@ -14362,7 +14362,7 @@
     </w:p>
     <w:bookmarkEnd w:id="81"/>
     <w:bookmarkEnd w:id="82"/>
-    <w:bookmarkStart w:id="83" w:name="X2fd92483128a5add758ee2b2eb0099452b15daa"/>
+    <w:bookmarkStart w:id="86" w:name="X2fd92483128a5add758ee2b2eb0099452b15daa"/>
     <w:p>
       <w:pPr>
         <w:pStyle w:val="Heading2"/>
@@ -15223,8 +15223,65 @@
         <w:t xml:space="preserve">The 2009/2010 marginal placebo significance in the ITS is a within-unit artefact that reflects the pre-existing downward trend in the Kazakhstan–China balance. The TWFE DiD absorbs this trend via year fixed effects and confirms the 2013 break is genuinely China-specific.</w:t>
       </w:r>
     </w:p>
-    <w:bookmarkEnd w:id="83"/>
-    <w:bookmarkStart w:id="87" w:name="synthetic-counterfactual"/>
+    <w:p>
+      <w:pPr>
+        <w:pStyle w:val="BodyText"/>
+      </w:pPr>
+      <w:r>
+        <w:drawing>
+          <wp:inline>
+            <wp:extent cx="5334000" cy="2667000"/>
+            <wp:effectExtent b="0" l="0" r="0" t="0"/>
+            <wp:docPr descr="Figure DiD. Event Study: Kazakhstan–China Balance vs. Other Partners (2013 = reference year)" title="" id="84" name="Picture"/>
+            <a:graphic>
+              <a:graphicData uri="http://schemas.openxmlformats.org/drawingml/2006/picture">
+                <pic:pic>
+                  <pic:nvPicPr>
+                    <pic:cNvPr descr="../Outputs/generated_figures/fig_did_event_study.png" id="85" name="Picture"/>
+                    <pic:cNvPicPr>
+                      <a:picLocks noChangeArrowheads="1" noChangeAspect="1"/>
+                    </pic:cNvPicPr>
+                  </pic:nvPicPr>
+                  <pic:blipFill>
+                    <a:blip r:embed="rId83"/>
+                    <a:stretch>
+                      <a:fillRect/>
+                    </a:stretch>
+                  </pic:blipFill>
+                  <pic:spPr bwMode="auto">
+                    <a:xfrm>
+                      <a:off x="0" y="0"/>
+                      <a:ext cx="5334000" cy="2667000"/>
+                    </a:xfrm>
+                    <a:prstGeom prst="rect">
+                      <a:avLst/>
+                    </a:prstGeom>
+                    <a:noFill/>
+                    <a:ln w="9525">
+                      <a:noFill/>
+                      <a:headEnd/>
+                      <a:tailEnd/>
+                    </a:ln>
+                  </pic:spPr>
+                </pic:pic>
+              </a:graphicData>
+            </a:graphic>
+          </wp:inline>
+        </w:drawing>
+      </w:r>
+      <w:r>
+        <w:t xml:space="preserve"> </w:t>
+      </w:r>
+      <w:r>
+        <w:rPr>
+          <w:i/>
+          <w:iCs/>
+        </w:rPr>
+        <w:t xml:space="preserve">Note: Actual balance ratio series with BRI 2013 break marker and ITS placebo years. Author’s construction.</w:t>
+      </w:r>
+    </w:p>
+    <w:bookmarkEnd w:id="86"/>
+    <w:bookmarkStart w:id="90" w:name="synthetic-counterfactual"/>
     <w:p>
       <w:pPr>
         <w:pStyle w:val="Heading2"/>
@@ -15925,18 +15982,18 @@
           <wp:inline>
             <wp:extent cx="5334000" cy="3879272"/>
             <wp:effectExtent b="0" l="0" r="0" t="0"/>
-            <wp:docPr descr="Figure 7. Synthetic Counterfactual: Actual vs. Synthetic KZ-China Trade Balance Ratio" title="" id="85" name="Picture"/>
+            <wp:docPr descr="Figure 7. Synthetic Counterfactual: Actual vs. Synthetic KZ-China Trade Balance Ratio" title="" id="88" name="Picture"/>
             <a:graphic>
               <a:graphicData uri="http://schemas.openxmlformats.org/drawingml/2006/picture">
                 <pic:pic>
                   <pic:nvPicPr>
-                    <pic:cNvPr descr="../Outputs/generated_figures/fig_synthetic_control.png" id="86" name="Picture"/>
+                    <pic:cNvPr descr="../Outputs/generated_figures/fig_synthetic_control.png" id="89" name="Picture"/>
                     <pic:cNvPicPr>
                       <a:picLocks noChangeArrowheads="1" noChangeAspect="1"/>
                     </pic:cNvPicPr>
                   </pic:nvPicPr>
                   <pic:blipFill>
-                    <a:blip r:embed="rId84"/>
+                    <a:blip r:embed="rId87"/>
                     <a:stretch>
                       <a:fillRect/>
                     </a:stretch>
@@ -16396,9 +16453,9 @@
         <w:t xml:space="preserve">(versus concurrent geopolitical shocks in 2022–2023) cannot be conclusively established. Causal language remains reserved for the DiD finding only; the regression interaction is described as a conditional association.</w:t>
       </w:r>
     </w:p>
-    <w:bookmarkEnd w:id="87"/>
-    <w:bookmarkEnd w:id="88"/>
-    <w:bookmarkStart w:id="93" w:name="discussion"/>
+    <w:bookmarkEnd w:id="90"/>
+    <w:bookmarkEnd w:id="91"/>
+    <w:bookmarkStart w:id="96" w:name="discussion"/>
     <w:p>
       <w:pPr>
         <w:pStyle w:val="Heading1"/>
@@ -16407,7 +16464,7 @@
         <w:t xml:space="preserve">7. Discussion</w:t>
       </w:r>
     </w:p>
-    <w:bookmarkStart w:id="89" w:name="what-the-results-show"/>
+    <w:bookmarkStart w:id="92" w:name="what-the-results-show"/>
     <w:p>
       <w:pPr>
         <w:pStyle w:val="Heading2"/>
@@ -16482,8 +16539,8 @@
         <w:t xml:space="preserve">asymmetric interdependence deepening post-BRI.</w:t>
       </w:r>
     </w:p>
-    <w:bookmarkEnd w:id="89"/>
-    <w:bookmarkStart w:id="90" w:name="what-the-results-do-not-show"/>
+    <w:bookmarkEnd w:id="92"/>
+    <w:bookmarkStart w:id="93" w:name="what-the-results-do-not-show"/>
     <w:p>
       <w:pPr>
         <w:pStyle w:val="Heading2"/>
@@ -16596,8 +16653,8 @@
         <w:t xml:space="preserve">The coefficient should be read as evidence that the trade-balance association of mineral exports weakened in the post-BRI period, not as a causal multiplier. The sanctions robustness check (§6.14) cannot rule out that part or all of the post-2013 interaction is driven by the 2022–2023 Russia-sanctions routing rather than BRI-specific structural deepening.</w:t>
       </w:r>
     </w:p>
-    <w:bookmarkEnd w:id="90"/>
-    <w:bookmarkStart w:id="91" w:name="X159a95f1f75e4cb9d73376d92636dad3144bb28"/>
+    <w:bookmarkEnd w:id="93"/>
+    <w:bookmarkStart w:id="94" w:name="X159a95f1f75e4cb9d73376d92636dad3144bb28"/>
     <w:p>
       <w:pPr>
         <w:pStyle w:val="Heading2"/>
@@ -16622,8 +16679,8 @@
         <w:t xml:space="preserve">However, from an econometric standpoint, 2023 possesses extremely high leverage. Because inference in a 24-observation dataset is fragile, the results must be reported transparently with and without this year. The full-sample interaction coefficient and the excluding-2023 estimates should be treated as co-equal evidence. The core conclusion of this thesis—that the bilateral trade relationship has grown increasingly fragile and asymmetric—is supported by the descriptive decomposition and the 2023 outcome itself, but the formal claim of a stable, systematic post-BRI statistical interaction effect must not depend solely on the full-sample regression coefficient.</w:t>
       </w:r>
     </w:p>
-    <w:bookmarkEnd w:id="91"/>
-    <w:bookmarkStart w:id="92" w:name="policy-implications"/>
+    <w:bookmarkEnd w:id="94"/>
+    <w:bookmarkStart w:id="95" w:name="policy-implications"/>
     <w:p>
       <w:pPr>
         <w:pStyle w:val="Heading2"/>
@@ -16788,9 +16845,9 @@
         <w:t xml:space="preserve">requiring policy response rather than a statistical anomaly.</w:t>
       </w:r>
     </w:p>
-    <w:bookmarkEnd w:id="92"/>
-    <w:bookmarkEnd w:id="93"/>
-    <w:bookmarkStart w:id="96" w:name="conclusion"/>
+    <w:bookmarkEnd w:id="95"/>
+    <w:bookmarkEnd w:id="96"/>
+    <w:bookmarkStart w:id="99" w:name="conclusion"/>
     <w:p>
       <w:pPr>
         <w:pStyle w:val="Heading1"/>
@@ -16860,7 +16917,7 @@
         <w:t xml:space="preserve">The thesis therefore identifies a China-specific, increasingly adverse bilateral pattern that is strongly consistent with asymmetric interdependence theory. The strongest empirical contributions are: the descriptive decomposition showing import-side deepening as the primary mechanism; the TWFE DiD demonstrating China-specificity; and the transparent reporting of regression fragility and influence diagnostics.</w:t>
       </w:r>
     </w:p>
-    <w:bookmarkStart w:id="94" w:name="interpretation-discipline"/>
+    <w:bookmarkStart w:id="97" w:name="interpretation-discipline"/>
     <w:p>
       <w:pPr>
         <w:pStyle w:val="Heading2"/>
@@ -16893,8 +16950,8 @@
         <w:t xml:space="preserve">— not a common shock across trading partners — as demonstrated by the TWFE DiD partner-placebo design (§6.15). It cannot claim that BRI causally worsened Kazakhstan’s trade balance, because the regression interaction does not survive exclusion of the 2022–2023 sanctions period and an alternative explanation via parallel-import routing cannot be ruled out. The TWFE DiD finding is the most causally credible result; the regression interaction is a conditional association.</w:t>
       </w:r>
     </w:p>
-    <w:bookmarkEnd w:id="94"/>
-    <w:bookmarkStart w:id="95" w:name="limitations-and-future-research"/>
+    <w:bookmarkEnd w:id="97"/>
+    <w:bookmarkStart w:id="98" w:name="limitations-and-future-research"/>
     <w:p>
       <w:pPr>
         <w:pStyle w:val="Heading2"/>
@@ -16940,9 +16997,9 @@
         <w:t xml:space="preserve">The finding that mineral export growth did not translate into trade-balance improvement is consistent with the broader resource-dependence literature: export success in raw materials does not automatically improve external balance when the trading partner’s diversified export capacity grows faster. For Kazakhstan and comparable corridor economies, this diagnostic evidence suggests that BRI participation should be evaluated not by aggregate trade volumes but by the composition and balance of bilateral exchange.</w:t>
       </w:r>
     </w:p>
-    <w:bookmarkEnd w:id="95"/>
-    <w:bookmarkEnd w:id="96"/>
-    <w:bookmarkStart w:id="98" w:name="references"/>
+    <w:bookmarkEnd w:id="98"/>
+    <w:bookmarkEnd w:id="99"/>
+    <w:bookmarkStart w:id="101" w:name="references"/>
     <w:p>
       <w:pPr>
         <w:pStyle w:val="Heading1"/>
@@ -16951,10 +17008,10 @@
         <w:t xml:space="preserve">References</w:t>
       </w:r>
     </w:p>
-    <w:bookmarkStart w:id="97" w:name="refs"/>
-    <w:bookmarkEnd w:id="97"/>
-    <w:bookmarkEnd w:id="98"/>
-    <w:bookmarkStart w:id="99" w:name="X8917230a2959afca4ead821100be5c041b382e2"/>
+    <w:bookmarkStart w:id="100" w:name="refs"/>
+    <w:bookmarkEnd w:id="100"/>
+    <w:bookmarkEnd w:id="101"/>
+    <w:bookmarkStart w:id="102" w:name="X8917230a2959afca4ead821100be5c041b382e2"/>
     <w:p>
       <w:pPr>
         <w:pStyle w:val="Heading1"/>
@@ -18512,8 +18569,8 @@
         </w:tc>
       </w:tr>
     </w:tbl>
-    <w:bookmarkEnd w:id="99"/>
-    <w:bookmarkStart w:id="102" w:name="appendix-b-pre-revision-specification"/>
+    <w:bookmarkEnd w:id="102"/>
+    <w:bookmarkStart w:id="105" w:name="appendix-b-pre-revision-specification"/>
     <w:p>
       <w:pPr>
         <w:pStyle w:val="Heading1"/>
@@ -18534,7 +18591,7 @@
         <w:t xml:space="preserve">This appendix documents the pre-revision OLS specification that used log(KZ GDP) and log(CN GDP) as separate level regressors. It is retained for transparency, enabling direct comparison between the midterm and final specifications and illustrating how multicollinearity resolution affected the estimates.</w:t>
       </w:r>
     </w:p>
-    <w:bookmarkStart w:id="100" w:name="appendix-b.1-pre-revision-full-model-a1"/>
+    <w:bookmarkStart w:id="103" w:name="appendix-b.1-pre-revision-full-model-a1"/>
     <w:p>
       <w:pPr>
         <w:pStyle w:val="Heading2"/>
@@ -19096,8 +19153,8 @@
         <w:t xml:space="preserve">Notes: The large constant (197.6), implausible GDP coefficient magnitudes, and max VIF &gt; 100 indicate that this specification’s coefficients absorb trending collinearity rather than identifying genuine partial effects. This specification is superseded by the growth-rate model (Scheme B, primary) and gravity-ratio model (Scheme C, robustness) in the final version.</w:t>
       </w:r>
     </w:p>
-    <w:bookmarkEnd w:id="100"/>
-    <w:bookmarkStart w:id="101" w:name="Xfc43d264906fd36d64ff21af4fbc70df67b82f2"/>
+    <w:bookmarkEnd w:id="103"/>
+    <w:bookmarkStart w:id="104" w:name="Xfc43d264906fd36d64ff21af4fbc70df67b82f2"/>
     <w:p>
       <w:pPr>
         <w:pStyle w:val="Heading2"/>
@@ -19545,8 +19602,8 @@
         <w:t xml:space="preserve">Notes: This specification achieved VIF &lt; 10 by excluding GDP controls entirely. The final primary specification (Scheme B, GDP growth rates) retains GDP-related regressors in stationary form (d.log), achieving max VIF = 10.4. The Scheme C gravity-ratio specification is reported as a robustness check (max VIF = 33.4).</w:t>
       </w:r>
     </w:p>
-    <w:bookmarkEnd w:id="101"/>
-    <w:bookmarkEnd w:id="102"/>
+    <w:bookmarkEnd w:id="104"/>
+    <w:bookmarkEnd w:id="105"/>
     <w:sectPr>
       <w:footnotePr>
         <w:numRestart w:val="eachSect"/>

</xml_diff>